<commit_message>
Add NIT camel segmentation internship
</commit_message>
<xml_diff>
--- a/Kratish_Mewada_Resume.docx
+++ b/Kratish_Mewada_Resume.docx
@@ -397,7 +397,7 @@
           <w:b w:val="0"/>
           <w:i w:val="0"/>
         </w:rPr>
-        <w:t>Architected a 7-agent incident-management platform across 4 categories using FastAPI, PostgreSQL, LangGraph, LangChain, ChromaDB, and RAG to diagnose incidents, assess impact, select contractors, and communicate with residents.</w:t>
+        <w:t>Built a 7-agent incident-management platform with FastAPI, PostgreSQL, LangGraph, and RAG to diagnose issues, assess impact, recommend contractors, and update residents.</w:t>
       </w:r>
     </w:p>
     <w:p>
@@ -418,49 +418,7 @@
           <w:b w:val="0"/>
           <w:i w:val="0"/>
         </w:rPr>
-        <w:t>Built 15+ REST APIs across 15+ database entities, with 4-role RBAC, async SQLAlchemy, Alembic migrations, structured LLM outputs, and GPT-4 fallback.</w:t>
-      </w:r>
-    </w:p>
-    <w:p>
-      <w:pPr>
-        <w:spacing w:after="20"/>
-        <w:ind w:left="202" w:hanging="173"/>
-        <w:jc w:val="both"/>
-      </w:pPr>
-      <w:r>
-        <w:rPr>
-          <w:b/>
-          <w:i w:val="0"/>
-        </w:rPr>
-        <w:t xml:space="preserve">• </w:t>
-      </w:r>
-      <w:r>
-        <w:rPr>
-          <w:b w:val="0"/>
-          <w:i w:val="0"/>
-        </w:rPr>
-        <w:t>Implemented 6+ impact metrics and predictive workflows for repair cost and duration.</w:t>
-      </w:r>
-    </w:p>
-    <w:p>
-      <w:pPr>
-        <w:spacing w:after="20"/>
-        <w:ind w:left="202" w:hanging="173"/>
-        <w:jc w:val="both"/>
-      </w:pPr>
-      <w:r>
-        <w:rPr>
-          <w:b/>
-          <w:i w:val="0"/>
-        </w:rPr>
-        <w:t xml:space="preserve">• </w:t>
-      </w:r>
-      <w:r>
-        <w:rPr>
-          <w:b w:val="0"/>
-          <w:i w:val="0"/>
-        </w:rPr>
-        <w:t>Added idempotency, checkpointing, circuit breakers, Saga recovery, and correlation-ID tracing; validated with Docker, Locust, and 88 automated tests.</w:t>
+        <w:t>Implemented 15+ REST APIs, 15+ database entities, 4-role RBAC, predictive cost/duration workflows, and reliability controls; validated with 88 automated tests and Locust.</w:t>
       </w:r>
     </w:p>
     <w:p>
@@ -512,28 +470,7 @@
           <w:b w:val="0"/>
           <w:i w:val="0"/>
         </w:rPr>
-        <w:t>Collaborated with a teammate on a Kotlin/Jetpack Compose app using Room and DataStore for study planning, preparation tracking, bookmarks, and offline company-question search; the APK is about 32 MB and targets SDK 35 (Android 8+ / API 26+).</w:t>
-      </w:r>
-    </w:p>
-    <w:p>
-      <w:pPr>
-        <w:spacing w:after="20"/>
-        <w:ind w:left="202" w:hanging="173"/>
-        <w:jc w:val="both"/>
-      </w:pPr>
-      <w:r>
-        <w:rPr>
-          <w:b/>
-          <w:i w:val="0"/>
-        </w:rPr>
-        <w:t xml:space="preserve">• </w:t>
-      </w:r>
-      <w:r>
-        <w:rPr>
-          <w:b w:val="0"/>
-          <w:i w:val="0"/>
-        </w:rPr>
-        <w:t>The app includes Groq-powered study planning, doubt assistance, and interview feedback, plus an offline dataset with 17,826 question entries across 659 companies.</w:t>
+        <w:t>Built with a teammate in Kotlin/Jetpack Compose, with offline company-question search, study planning, bookmarks, and Groq-powered interview support; 32 MB APK, Android 8+ (API 26+), target SDK 35.</w:t>
       </w:r>
     </w:p>
     <w:p>
@@ -646,7 +583,39 @@
           <w:b w:val="0"/>
           <w:i w:val="0"/>
         </w:rPr>
-        <w:t>Built a real-time multiplayer sketch-and-guess application using Node.js, Express.js, and Socket.io, implementing event-driven bidirectional communication for drawing, guessing, and chat.</w:t>
+        <w:t>Built a real-time multiplayer drawing and guessing game with Socket.io, role-based play, automatic drawer rotation, synchronized scoring, and chat.</w:t>
+      </w:r>
+    </w:p>
+    <w:p>
+      <w:pPr>
+        <w:spacing w:before="100" w:after="40"/>
+        <w:pBdr>
+          <w:top w:val="single" w:sz="5" w:space="3" w:color="B8B8B8"/>
+        </w:pBdr>
+      </w:pPr>
+      <w:r>
+        <w:rPr>
+          <w:b/>
+          <w:i w:val="0"/>
+          <w:color w:val="264D91"/>
+          <w:sz w:val="19"/>
+        </w:rPr>
+        <w:t>EXPERIENCE</w:t>
+      </w:r>
+    </w:p>
+    <w:p>
+      <w:pPr>
+        <w:spacing w:before="30" w:after="20"/>
+        <w:jc w:val="left"/>
+      </w:pPr>
+      <w:r>
+        <w:rPr>
+          <w:b/>
+          <w:i w:val="0"/>
+          <w:color w:val="1C2A37"/>
+          <w:sz w:val="17"/>
+        </w:rPr>
+        <w:t>AI/ML Intern • National Institute of Technology Tiruchirappalli</w:t>
       </w:r>
     </w:p>
     <w:p>
@@ -667,24 +636,7 @@
           <w:b w:val="0"/>
           <w:i w:val="0"/>
         </w:rPr>
-        <w:t>Added role-based gameplay, player management, automated drawer rotation, and real-time state synchronization across 60-second rounds, 10-point scoring, and 20 drawing prompts.</w:t>
-      </w:r>
-    </w:p>
-    <w:p>
-      <w:pPr>
-        <w:spacing w:before="100" w:after="40"/>
-        <w:pBdr>
-          <w:top w:val="single" w:sz="5" w:space="3" w:color="B8B8B8"/>
-        </w:pBdr>
-      </w:pPr>
-      <w:r>
-        <w:rPr>
-          <w:b/>
-          <w:i w:val="0"/>
-          <w:color w:val="264D91"/>
-          <w:sz w:val="19"/>
-        </w:rPr>
-        <w:t>EXPERIENCE</w:t>
+        <w:t>Trained a YOLO11s-Seg model on a custom annotated camel dataset and integrated image upload, body-part segmentation, and result visualization in Flask; extending it with normalized body-ratio comparison against selected reference camels.</w:t>
       </w:r>
     </w:p>
     <w:p>

</xml_diff>

<commit_message>
Expand project stories and polish portfolio motion
</commit_message>
<xml_diff>
--- a/Kratish_Mewada_Resume.docx
+++ b/Kratish_Mewada_Resume.docx
@@ -141,24 +141,24 @@
     </w:p>
     <w:p>
       <w:pPr>
-        <w:spacing w:before="100" w:after="40"/>
+        <w:spacing w:before="120" w:after="50"/>
         <w:pBdr>
-          <w:top w:val="single" w:sz="5" w:space="3" w:color="B8B8B8"/>
+          <w:top w:val="single" w:sz="4" w:space="3" w:color="D3DAE3"/>
         </w:pBdr>
       </w:pPr>
       <w:r>
         <w:rPr>
-          <w:b/>
+          <w:b w:val="0"/>
           <w:i w:val="0"/>
-          <w:color w:val="264D91"/>
-          <w:sz w:val="19"/>
+          <w:color w:val="69809E"/>
+          <w:sz w:val="18"/>
         </w:rPr>
         <w:t>PROFESSIONAL SUMMARY</w:t>
       </w:r>
     </w:p>
     <w:p>
       <w:pPr>
-        <w:spacing w:after="20" w:before="0"/>
+        <w:spacing w:after="40" w:before="0"/>
         <w:jc w:val="both"/>
       </w:pPr>
       <w:r>
@@ -166,22 +166,22 @@
           <w:b w:val="0"/>
           <w:i w:val="0"/>
         </w:rPr>
-        <w:t>Software engineering candidate focused on backend and AI/LLM systems, with hands-on experience designing REST APIs, database-driven applications, and real-time systems. Built a multi-agent infrastructure platform combining retrieval-augmented generation (RAG), predictive analytics, and reliability engineering across 15+ REST APIs and 15+ database entities. Solved 800+ Data Structures &amp; Algorithms problems overall, reaching a LeetCode peak rating of 1806 (Top 8.06%).</w:t>
+        <w:t>MCA candidate building backend services, AI/LLM applications, and computer-vision tools. Experienced with API design, database-backed systems, and shipping usable applications; solved 800+ DSA problems overall.</w:t>
       </w:r>
     </w:p>
     <w:p>
       <w:pPr>
-        <w:spacing w:before="100" w:after="40"/>
+        <w:spacing w:before="120" w:after="50"/>
         <w:pBdr>
-          <w:top w:val="single" w:sz="5" w:space="3" w:color="B8B8B8"/>
+          <w:top w:val="single" w:sz="4" w:space="3" w:color="D3DAE3"/>
         </w:pBdr>
       </w:pPr>
       <w:r>
         <w:rPr>
-          <w:b/>
+          <w:b w:val="0"/>
           <w:i w:val="0"/>
-          <w:color w:val="264D91"/>
-          <w:sz w:val="19"/>
+          <w:color w:val="69809E"/>
+          <w:sz w:val="18"/>
         </w:rPr>
         <w:t>TECHNICAL SKILLS</w:t>
       </w:r>
@@ -216,7 +216,7 @@
           <w:b/>
           <w:i w:val="0"/>
         </w:rPr>
-        <w:t xml:space="preserve">Backend &amp; APIs: </w:t>
+        <w:t xml:space="preserve">Backend: </w:t>
       </w:r>
       <w:r>
         <w:rPr>
@@ -236,14 +236,14 @@
           <w:b/>
           <w:i w:val="0"/>
         </w:rPr>
-        <w:t xml:space="preserve">AI/LLM: </w:t>
+        <w:t xml:space="preserve">AI &amp; Computer Vision: </w:t>
       </w:r>
       <w:r>
         <w:rPr>
           <w:b w:val="0"/>
           <w:i w:val="0"/>
         </w:rPr>
-        <w:t>LangGraph, LangChain, RAG, Multi-Agent Systems, ChromaDB, Vector Embeddings</w:t>
+        <w:t>LangGraph, LangChain, RAG, ChromaDB, YOLO11-Seg</w:t>
       </w:r>
     </w:p>
     <w:p>
@@ -256,7 +256,7 @@
           <w:b/>
           <w:i w:val="0"/>
         </w:rPr>
-        <w:t xml:space="preserve">Databases: </w:t>
+        <w:t xml:space="preserve">Data: </w:t>
       </w:r>
       <w:r>
         <w:rPr>
@@ -276,64 +276,44 @@
           <w:b/>
           <w:i w:val="0"/>
         </w:rPr>
-        <w:t xml:space="preserve">Engineering: </w:t>
+        <w:t xml:space="preserve">Tools &amp; Practices: </w:t>
       </w:r>
       <w:r>
         <w:rPr>
           <w:b w:val="0"/>
           <w:i w:val="0"/>
         </w:rPr>
-        <w:t>JWT, RBAC, CRUD, Automated Testing, Idempotency, Circuit Breaker, Error Handling</w:t>
+        <w:t>Git, Docker, Postman, JWT, RBAC, automated testing</w:t>
       </w:r>
     </w:p>
     <w:p>
       <w:pPr>
-        <w:spacing w:after="0"/>
-        <w:jc w:val="both"/>
+        <w:spacing w:before="120" w:after="50"/>
+        <w:pBdr>
+          <w:top w:val="single" w:sz="4" w:space="3" w:color="D3DAE3"/>
+        </w:pBdr>
       </w:pPr>
-      <w:r>
-        <w:rPr>
-          <w:b/>
-          <w:i w:val="0"/>
-        </w:rPr>
-        <w:t xml:space="preserve">Tools: </w:t>
-      </w:r>
       <w:r>
         <w:rPr>
           <w:b w:val="0"/>
           <w:i w:val="0"/>
-        </w:rPr>
-        <w:t>Git, GitHub, Docker, Postman, AWS</w:t>
-      </w:r>
-    </w:p>
-    <w:p>
-      <w:pPr>
-        <w:spacing w:before="100" w:after="40"/>
-        <w:pBdr>
-          <w:top w:val="single" w:sz="5" w:space="3" w:color="B8B8B8"/>
-        </w:pBdr>
-      </w:pPr>
-      <w:r>
-        <w:rPr>
-          <w:b/>
-          <w:i w:val="0"/>
-          <w:color w:val="264D91"/>
-          <w:sz w:val="19"/>
+          <w:color w:val="69809E"/>
+          <w:sz w:val="18"/>
         </w:rPr>
         <w:t>PROJECTS</w:t>
       </w:r>
     </w:p>
     <w:p>
       <w:pPr>
-        <w:spacing w:before="30" w:after="20"/>
+        <w:spacing w:before="50" w:after="24"/>
         <w:jc w:val="left"/>
       </w:pPr>
       <w:r>
         <w:rPr>
-          <w:b/>
+          <w:b w:val="0"/>
           <w:i w:val="0"/>
-          <w:color w:val="1C2A37"/>
-          <w:sz w:val="17"/>
+          <w:color w:val="313B48"/>
+          <w:sz w:val="18"/>
         </w:rPr>
         <w:t>ASIP — Autonomous Society Infrastructure Platform</w:t>
       </w:r>
@@ -381,8 +361,8 @@
     </w:p>
     <w:p>
       <w:pPr>
-        <w:spacing w:after="20"/>
-        <w:ind w:left="202" w:hanging="173"/>
+        <w:spacing w:after="36"/>
+        <w:ind w:left="230" w:hanging="173"/>
         <w:jc w:val="both"/>
       </w:pPr>
       <w:r>
@@ -397,13 +377,13 @@
           <w:b w:val="0"/>
           <w:i w:val="0"/>
         </w:rPr>
-        <w:t>Built a 7-agent incident-management platform with FastAPI, PostgreSQL, LangGraph, and RAG to diagnose issues, assess impact, recommend contractors, and update residents.</w:t>
+        <w:t>Designed a multi-agent workflow that takes a reported society issue from intake through diagnosis, impact assessment, contractor recommendation, and resident updates. Built with FastAPI, PostgreSQL, LangGraph, LangChain, and RAG across 7 agents and 4 incident categories.</w:t>
       </w:r>
     </w:p>
     <w:p>
       <w:pPr>
-        <w:spacing w:after="20"/>
-        <w:ind w:left="202" w:hanging="173"/>
+        <w:spacing w:after="36"/>
+        <w:ind w:left="230" w:hanging="173"/>
         <w:jc w:val="both"/>
       </w:pPr>
       <w:r>
@@ -418,20 +398,20 @@
           <w:b w:val="0"/>
           <w:i w:val="0"/>
         </w:rPr>
-        <w:t>Implemented 15+ REST APIs, 15+ database entities, 4-role RBAC, predictive cost/duration workflows, and reliability controls; validated with 88 automated tests and Locust.</w:t>
+        <w:t>Implemented 15+ REST APIs, 15+ database entities, 4-role RBAC, and repair cost/duration estimates. Added idempotency, circuit breakers, Saga recovery, and correlation-ID tracing; exercised the system with 88 tests and Locust.</w:t>
       </w:r>
     </w:p>
     <w:p>
       <w:pPr>
-        <w:spacing w:before="30" w:after="20"/>
+        <w:spacing w:before="50" w:after="24"/>
         <w:jc w:val="left"/>
       </w:pPr>
       <w:r>
         <w:rPr>
-          <w:b/>
+          <w:b w:val="0"/>
           <w:i w:val="0"/>
-          <w:color w:val="1C2A37"/>
-          <w:sz w:val="17"/>
+          <w:color w:val="313B48"/>
+          <w:sz w:val="18"/>
         </w:rPr>
         <w:t>Placement Companion — Android Placement Prep App</w:t>
       </w:r>
@@ -454,8 +434,8 @@
     </w:p>
     <w:p>
       <w:pPr>
-        <w:spacing w:after="20"/>
-        <w:ind w:left="202" w:hanging="173"/>
+        <w:spacing w:after="36"/>
+        <w:ind w:left="230" w:hanging="173"/>
         <w:jc w:val="both"/>
       </w:pPr>
       <w:r>
@@ -470,20 +450,41 @@
           <w:b w:val="0"/>
           <w:i w:val="0"/>
         </w:rPr>
-        <w:t>Built with a teammate in Kotlin/Jetpack Compose, with offline company-question search, study planning, bookmarks, and Groq-powered interview support; 32 MB APK, Android 8+ (API 26+), target SDK 35.</w:t>
+        <w:t>Built with a teammate in Kotlin and Jetpack Compose to help students plan preparation, track study, bookmark questions, and search company interview questions offline.</w:t>
       </w:r>
     </w:p>
     <w:p>
       <w:pPr>
-        <w:spacing w:before="30" w:after="20"/>
-        <w:jc w:val="left"/>
+        <w:spacing w:after="36"/>
+        <w:ind w:left="230" w:hanging="173"/>
+        <w:jc w:val="both"/>
       </w:pPr>
       <w:r>
         <w:rPr>
           <w:b/>
           <w:i w:val="0"/>
-          <w:color w:val="1C2A37"/>
-          <w:sz w:val="17"/>
+        </w:rPr>
+        <w:t xml:space="preserve">• </w:t>
+      </w:r>
+      <w:r>
+        <w:rPr>
+          <w:b w:val="0"/>
+          <w:i w:val="0"/>
+        </w:rPr>
+        <w:t>Added Groq-powered study plans, doubt assistance, and interview feedback; the offline library covers 17,826 questions from 659 companies. Packaged as a 32 MB APK for Android 8+ (API 26+), targeting SDK 35.</w:t>
+      </w:r>
+    </w:p>
+    <w:p>
+      <w:pPr>
+        <w:spacing w:before="50" w:after="24"/>
+        <w:jc w:val="left"/>
+      </w:pPr>
+      <w:r>
+        <w:rPr>
+          <w:b w:val="0"/>
+          <w:i w:val="0"/>
+          <w:color w:val="313B48"/>
+          <w:sz w:val="18"/>
         </w:rPr>
         <w:t>Code Obfuscator</w:t>
       </w:r>
@@ -506,8 +507,8 @@
     </w:p>
     <w:p>
       <w:pPr>
-        <w:spacing w:after="20"/>
-        <w:ind w:left="202" w:hanging="173"/>
+        <w:spacing w:after="36"/>
+        <w:ind w:left="230" w:hanging="173"/>
         <w:jc w:val="both"/>
       </w:pPr>
       <w:r>
@@ -522,20 +523,20 @@
           <w:b w:val="0"/>
           <w:i w:val="0"/>
         </w:rPr>
-        <w:t>Built a Flask-backed C++ obfuscation tool with configurable identifier renaming, junk-code insertion, opaque predicates, string obfuscation, and numeric-literal masking.</w:t>
+        <w:t>Built a Flask web tool for transforming C++ source with selectable identifier renaming, junk-code insertion, opaque predicates, string obfuscation, and numeric-literal masking.</w:t>
       </w:r>
     </w:p>
     <w:p>
       <w:pPr>
-        <w:spacing w:before="30" w:after="20"/>
+        <w:spacing w:before="50" w:after="24"/>
         <w:jc w:val="left"/>
       </w:pPr>
       <w:r>
         <w:rPr>
-          <w:b/>
+          <w:b w:val="0"/>
           <w:i w:val="0"/>
-          <w:color w:val="1C2A37"/>
-          <w:sz w:val="17"/>
+          <w:color w:val="313B48"/>
+          <w:sz w:val="18"/>
         </w:rPr>
         <w:t>Sketch It — Real-Time Multiplayer Game</w:t>
       </w:r>
@@ -567,8 +568,8 @@
     </w:p>
     <w:p>
       <w:pPr>
-        <w:spacing w:after="20"/>
-        <w:ind w:left="202" w:hanging="173"/>
+        <w:spacing w:after="36"/>
+        <w:ind w:left="230" w:hanging="173"/>
         <w:jc w:val="both"/>
       </w:pPr>
       <w:r>
@@ -583,45 +584,45 @@
           <w:b w:val="0"/>
           <w:i w:val="0"/>
         </w:rPr>
-        <w:t>Built a real-time multiplayer drawing and guessing game with Socket.io, role-based play, automatic drawer rotation, synchronized scoring, and chat.</w:t>
+        <w:t>Created a browser-based drawing-and-guessing game: one player draws while others guess, with Socket.io synchronizing turns, chat, and scoring across the room.</w:t>
       </w:r>
     </w:p>
     <w:p>
       <w:pPr>
-        <w:spacing w:before="100" w:after="40"/>
+        <w:spacing w:before="120" w:after="50"/>
         <w:pBdr>
-          <w:top w:val="single" w:sz="5" w:space="3" w:color="B8B8B8"/>
+          <w:top w:val="single" w:sz="4" w:space="3" w:color="D3DAE3"/>
         </w:pBdr>
       </w:pPr>
       <w:r>
         <w:rPr>
-          <w:b/>
+          <w:b w:val="0"/>
           <w:i w:val="0"/>
-          <w:color w:val="264D91"/>
-          <w:sz w:val="19"/>
+          <w:color w:val="69809E"/>
+          <w:sz w:val="18"/>
         </w:rPr>
         <w:t>EXPERIENCE</w:t>
       </w:r>
     </w:p>
     <w:p>
       <w:pPr>
-        <w:spacing w:before="30" w:after="20"/>
+        <w:spacing w:before="50" w:after="24"/>
         <w:jc w:val="left"/>
       </w:pPr>
       <w:r>
         <w:rPr>
-          <w:b/>
+          <w:b w:val="0"/>
           <w:i w:val="0"/>
-          <w:color w:val="1C2A37"/>
-          <w:sz w:val="17"/>
+          <w:color w:val="313B48"/>
+          <w:sz w:val="18"/>
         </w:rPr>
         <w:t>AI/ML Intern • National Institute of Technology Tiruchirappalli</w:t>
       </w:r>
     </w:p>
     <w:p>
       <w:pPr>
-        <w:spacing w:after="20"/>
-        <w:ind w:left="202" w:hanging="173"/>
+        <w:spacing w:after="36"/>
+        <w:ind w:left="230" w:hanging="173"/>
         <w:jc w:val="both"/>
       </w:pPr>
       <w:r>
@@ -636,20 +637,41 @@
           <w:b w:val="0"/>
           <w:i w:val="0"/>
         </w:rPr>
-        <w:t>Trained a YOLO11s-Seg model on a custom annotated camel dataset and integrated image upload, body-part segmentation, and result visualization in Flask; extending it with normalized body-ratio comparison against selected reference camels.</w:t>
+        <w:t>Built a Flask application around a transfer-learned YOLO11s-Seg model, trained on 284 custom polygon-annotated camel images to identify head, legs, hump, tail, and stomach.</w:t>
       </w:r>
     </w:p>
     <w:p>
       <w:pPr>
-        <w:spacing w:before="30" w:after="20"/>
-        <w:jc w:val="left"/>
+        <w:spacing w:after="36"/>
+        <w:ind w:left="230" w:hanging="173"/>
+        <w:jc w:val="both"/>
       </w:pPr>
       <w:r>
         <w:rPr>
           <w:b/>
           <w:i w:val="0"/>
-          <w:color w:val="1C2A37"/>
-          <w:sz w:val="17"/>
+        </w:rPr>
+        <w:t xml:space="preserve">• </w:t>
+      </w:r>
+      <w:r>
+        <w:rPr>
+          <w:b w:val="0"/>
+          <w:i w:val="0"/>
+        </w:rPr>
+        <w:t>Now extending the project with additional anatomy and normalized body-ratio comparisons against selected reference camels; this comparison phase is in progress.</w:t>
+      </w:r>
+    </w:p>
+    <w:p>
+      <w:pPr>
+        <w:spacing w:before="50" w:after="24"/>
+        <w:jc w:val="left"/>
+      </w:pPr>
+      <w:r>
+        <w:rPr>
+          <w:b w:val="0"/>
+          <w:i w:val="0"/>
+          <w:color w:val="313B48"/>
+          <w:sz w:val="18"/>
         </w:rPr>
         <w:t>Backend Developer Intern • Vected Technologies Pvt. Ltd., Indore</w:t>
       </w:r>
@@ -665,8 +687,8 @@
     </w:p>
     <w:p>
       <w:pPr>
-        <w:spacing w:after="20"/>
-        <w:ind w:left="202" w:hanging="173"/>
+        <w:spacing w:after="36"/>
+        <w:ind w:left="230" w:hanging="173"/>
         <w:jc w:val="both"/>
       </w:pPr>
       <w:r>
@@ -681,13 +703,13 @@
           <w:b w:val="0"/>
           <w:i w:val="0"/>
         </w:rPr>
-        <w:t>Contributed to a BigBasket-inspired grocery commerce platform during a 2-month internship.</w:t>
+        <w:t>Contributed backend features to a BigBasket-inspired grocery commerce platform, building 7+ REST endpoints and JWT authentication.</w:t>
       </w:r>
     </w:p>
     <w:p>
       <w:pPr>
-        <w:spacing w:after="20"/>
-        <w:ind w:left="202" w:hanging="173"/>
+        <w:spacing w:after="36"/>
+        <w:ind w:left="230" w:hanging="173"/>
         <w:jc w:val="both"/>
       </w:pPr>
       <w:r>
@@ -702,43 +724,22 @@
           <w:b w:val="0"/>
           <w:i w:val="0"/>
         </w:rPr>
-        <w:t>Built 7+ REST API endpoints and implemented JWT-based authentication and CRUD operations within a structured, team-based development workflow.</w:t>
+        <w:t>Implemented CRUD workflows and validated API behavior with Postman in a team development workflow.</w:t>
       </w:r>
     </w:p>
     <w:p>
       <w:pPr>
-        <w:spacing w:after="20"/>
-        <w:ind w:left="202" w:hanging="173"/>
-        <w:jc w:val="both"/>
+        <w:spacing w:before="120" w:after="50"/>
+        <w:pBdr>
+          <w:top w:val="single" w:sz="4" w:space="3" w:color="D3DAE3"/>
+        </w:pBdr>
       </w:pPr>
-      <w:r>
-        <w:rPr>
-          <w:b/>
-          <w:i w:val="0"/>
-        </w:rPr>
-        <w:t xml:space="preserve">• </w:t>
-      </w:r>
       <w:r>
         <w:rPr>
           <w:b w:val="0"/>
           <w:i w:val="0"/>
-        </w:rPr>
-        <w:t>Validated API functionality through Postman-driven testing and worked with a teammate to deliver features on schedule.</w:t>
-      </w:r>
-    </w:p>
-    <w:p>
-      <w:pPr>
-        <w:spacing w:before="100" w:after="40"/>
-        <w:pBdr>
-          <w:top w:val="single" w:sz="5" w:space="3" w:color="B8B8B8"/>
-        </w:pBdr>
-      </w:pPr>
-      <w:r>
-        <w:rPr>
-          <w:b/>
-          <w:i w:val="0"/>
-          <w:color w:val="264D91"/>
-          <w:sz w:val="19"/>
+          <w:color w:val="69809E"/>
+          <w:sz w:val="18"/>
         </w:rPr>
         <w:t>EDUCATION</w:t>
       </w:r>
@@ -750,7 +751,7 @@
       </w:pPr>
       <w:r>
         <w:rPr>
-          <w:b/>
+          <w:b w:val="0"/>
           <w:i w:val="0"/>
         </w:rPr>
         <w:t>Master of Computer Applications (M.C.A.) • NIT Trichy • GPA: 7.73/10</w:t>
@@ -770,7 +771,7 @@
       </w:pPr>
       <w:r>
         <w:rPr>
-          <w:b/>
+          <w:b w:val="0"/>
           <w:i w:val="0"/>
         </w:rPr>
         <w:t>Bachelor of Science in Computer Science • Sanskar College of Professional Studies, Indore • GPA: 8.06/10</w:t>
@@ -785,17 +786,17 @@
     </w:p>
     <w:p>
       <w:pPr>
-        <w:spacing w:before="100" w:after="40"/>
+        <w:spacing w:before="120" w:after="50"/>
         <w:pBdr>
-          <w:top w:val="single" w:sz="5" w:space="3" w:color="B8B8B8"/>
+          <w:top w:val="single" w:sz="4" w:space="3" w:color="D3DAE3"/>
         </w:pBdr>
       </w:pPr>
       <w:r>
         <w:rPr>
-          <w:b/>
+          <w:b w:val="0"/>
           <w:i w:val="0"/>
-          <w:color w:val="264D91"/>
-          <w:sz w:val="19"/>
+          <w:color w:val="69809E"/>
+          <w:sz w:val="18"/>
         </w:rPr>
         <w:t>ACHIEVEMENTS &amp; COMPETITIVE PROGRAMMING</w:t>
       </w:r>
@@ -826,92 +827,9 @@
         <w:t>Problem Solving: 800+ DSA problems overall | Peak LeetCode Rating: 1806 (Top 8.06%) | CodeChef: 1403</w:t>
       </w:r>
     </w:p>
-    <w:p>
-      <w:pPr>
-        <w:spacing w:before="100" w:after="40"/>
-        <w:pBdr>
-          <w:top w:val="single" w:sz="5" w:space="3" w:color="B8B8B8"/>
-        </w:pBdr>
-      </w:pPr>
-      <w:r>
-        <w:rPr>
-          <w:b/>
-          <w:i w:val="0"/>
-          <w:color w:val="264D91"/>
-          <w:sz w:val="19"/>
-        </w:rPr>
-        <w:t>LEADERSHIP</w:t>
-      </w:r>
-    </w:p>
-    <w:p>
-      <w:pPr>
-        <w:spacing w:before="30" w:after="20"/>
-        <w:jc w:val="left"/>
-      </w:pPr>
-      <w:r>
-        <w:rPr>
-          <w:b/>
-          <w:i w:val="0"/>
-          <w:color w:val="1C2A37"/>
-          <w:sz w:val="17"/>
-        </w:rPr>
-        <w:t>Volunteer, VERSION'25 Event • NIT Trichy</w:t>
-      </w:r>
-      <w:r>
-        <w:rPr>
-          <w:b w:val="0"/>
-          <w:i w:val="0"/>
-          <w:color w:val="50585F"/>
-          <w:sz w:val="16"/>
-        </w:rPr>
-        <w:t xml:space="preserve">   Mar 2025</w:t>
-      </w:r>
-    </w:p>
-    <w:p>
-      <w:pPr>
-        <w:spacing w:after="20"/>
-        <w:ind w:left="202" w:hanging="173"/>
-        <w:jc w:val="both"/>
-      </w:pPr>
-      <w:r>
-        <w:rPr>
-          <w:b/>
-          <w:i w:val="0"/>
-        </w:rPr>
-        <w:t xml:space="preserve">• </w:t>
-      </w:r>
-      <w:r>
-        <w:rPr>
-          <w:b w:val="0"/>
-          <w:i w:val="0"/>
-        </w:rPr>
-        <w:t>Coordinated logistics and registration for VERSION'25, the 33rd edition of NIT Trichy's All India MCA Meet, a 3-day festival of technical and non-technical events.</w:t>
-      </w:r>
-    </w:p>
-    <w:p>
-      <w:pPr>
-        <w:spacing w:after="20"/>
-        <w:ind w:left="202" w:hanging="173"/>
-        <w:jc w:val="both"/>
-      </w:pPr>
-      <w:r>
-        <w:rPr>
-          <w:b/>
-          <w:i w:val="0"/>
-        </w:rPr>
-        <w:t xml:space="preserve">• </w:t>
-      </w:r>
-      <w:r>
-        <w:rPr>
-          <w:b w:val="0"/>
-          <w:i w:val="0"/>
-        </w:rPr>
-        <w:t>Supported cross-institution communication, hospitality, and alumni engagement for 130+ participants from 30+ institutions, and organized 11 events spanning coding, UI/UX, and web design.</w:t>
-      </w:r>
-    </w:p>
     <w:sectPr>
       <w:pgSz w:w="12240" w:h="15840"/>
-      <w:pgMar w:top="605" w:right="662" w:bottom="605" w:left="662" w:header="720" w:footer="720" w:gutter="0"/>
+      <w:pgMar w:top="691" w:right="749" w:bottom="691" w:left="749" w:header="720" w:footer="720" w:gutter="0"/>
       <w:cols w:space="720"/>
       <w:docGrid w:linePitch="360"/>
     </w:sectPr>
@@ -1283,12 +1201,12 @@
     <w:qFormat/>
     <w:rsid w:val="00FC693F"/>
     <w:pPr>
-      <w:spacing w:after="20" w:line="240" w:lineRule="auto"/>
+      <w:spacing w:after="30" w:line="245" w:lineRule="auto"/>
     </w:pPr>
     <w:rPr>
       <w:rFonts w:ascii="Times New Roman" w:hAnsi="Times New Roman" w:eastAsia="Times New Roman"/>
-      <w:color w:val="232A32"/>
-      <w:sz w:val="16"/>
+      <w:color w:val="2A2F37"/>
+      <w:sz w:val="17"/>
     </w:rPr>
   </w:style>
   <w:style w:type="paragraph" w:styleId="Header">

</xml_diff>

<commit_message>
Publish polished project portfolio and resume
</commit_message>
<xml_diff>
--- a/Kratish_Mewada_Resume.docx
+++ b/Kratish_Mewada_Resume.docx
@@ -141,24 +141,24 @@
     </w:p>
     <w:p>
       <w:pPr>
-        <w:spacing w:before="100" w:after="40"/>
+        <w:spacing w:before="120" w:after="50"/>
         <w:pBdr>
-          <w:top w:val="single" w:sz="5" w:space="3" w:color="B8B8B8"/>
+          <w:top w:val="single" w:sz="4" w:space="3" w:color="D3DAE3"/>
         </w:pBdr>
       </w:pPr>
       <w:r>
         <w:rPr>
-          <w:b/>
+          <w:b w:val="0"/>
           <w:i w:val="0"/>
-          <w:color w:val="264D91"/>
-          <w:sz w:val="19"/>
+          <w:color w:val="69809E"/>
+          <w:sz w:val="18"/>
         </w:rPr>
         <w:t>PROFESSIONAL SUMMARY</w:t>
       </w:r>
     </w:p>
     <w:p>
       <w:pPr>
-        <w:spacing w:after="20" w:before="0"/>
+        <w:spacing w:after="40" w:before="0"/>
         <w:jc w:val="both"/>
       </w:pPr>
       <w:r>
@@ -166,22 +166,22 @@
           <w:b w:val="0"/>
           <w:i w:val="0"/>
         </w:rPr>
-        <w:t>Software engineering candidate focused on backend and AI/LLM systems, with hands-on experience designing REST APIs, database-driven applications, and real-time systems. Built a multi-agent infrastructure platform combining retrieval-augmented generation (RAG), predictive analytics, and reliability engineering across 15+ REST APIs and 15+ database entities. Solved 800+ Data Structures &amp; Algorithms problems overall, reaching a LeetCode peak rating of 1806 (Top 8.06%).</w:t>
+        <w:t>MCA candidate building backend services, AI/LLM applications, and computer-vision tools. Experienced with API design, database-backed systems, and shipping usable applications; solved 800+ DSA problems overall.</w:t>
       </w:r>
     </w:p>
     <w:p>
       <w:pPr>
-        <w:spacing w:before="100" w:after="40"/>
+        <w:spacing w:before="120" w:after="50"/>
         <w:pBdr>
-          <w:top w:val="single" w:sz="5" w:space="3" w:color="B8B8B8"/>
+          <w:top w:val="single" w:sz="4" w:space="3" w:color="D3DAE3"/>
         </w:pBdr>
       </w:pPr>
       <w:r>
         <w:rPr>
-          <w:b/>
+          <w:b w:val="0"/>
           <w:i w:val="0"/>
-          <w:color w:val="264D91"/>
-          <w:sz w:val="19"/>
+          <w:color w:val="69809E"/>
+          <w:sz w:val="18"/>
         </w:rPr>
         <w:t>TECHNICAL SKILLS</w:t>
       </w:r>
@@ -216,7 +216,7 @@
           <w:b/>
           <w:i w:val="0"/>
         </w:rPr>
-        <w:t xml:space="preserve">Backend &amp; APIs: </w:t>
+        <w:t xml:space="preserve">Backend: </w:t>
       </w:r>
       <w:r>
         <w:rPr>
@@ -236,14 +236,14 @@
           <w:b/>
           <w:i w:val="0"/>
         </w:rPr>
-        <w:t xml:space="preserve">AI/LLM: </w:t>
+        <w:t xml:space="preserve">AI &amp; Computer Vision: </w:t>
       </w:r>
       <w:r>
         <w:rPr>
           <w:b w:val="0"/>
           <w:i w:val="0"/>
         </w:rPr>
-        <w:t>LangGraph, LangChain, RAG, Multi-Agent Systems, ChromaDB, Vector Embeddings</w:t>
+        <w:t>LangGraph, LangChain, RAG, ChromaDB, YOLO11-Seg</w:t>
       </w:r>
     </w:p>
     <w:p>
@@ -256,7 +256,7 @@
           <w:b/>
           <w:i w:val="0"/>
         </w:rPr>
-        <w:t xml:space="preserve">Databases: </w:t>
+        <w:t xml:space="preserve">Data: </w:t>
       </w:r>
       <w:r>
         <w:rPr>
@@ -276,64 +276,44 @@
           <w:b/>
           <w:i w:val="0"/>
         </w:rPr>
-        <w:t xml:space="preserve">Engineering: </w:t>
+        <w:t xml:space="preserve">Tools &amp; Practices: </w:t>
       </w:r>
       <w:r>
         <w:rPr>
           <w:b w:val="0"/>
           <w:i w:val="0"/>
         </w:rPr>
-        <w:t>JWT, RBAC, CRUD, Automated Testing, Idempotency, Circuit Breaker, Error Handling</w:t>
+        <w:t>Git, Docker, Postman, JWT, RBAC, automated testing</w:t>
       </w:r>
     </w:p>
     <w:p>
       <w:pPr>
-        <w:spacing w:after="0"/>
-        <w:jc w:val="both"/>
+        <w:spacing w:before="120" w:after="50"/>
+        <w:pBdr>
+          <w:top w:val="single" w:sz="4" w:space="3" w:color="D3DAE3"/>
+        </w:pBdr>
       </w:pPr>
-      <w:r>
-        <w:rPr>
-          <w:b/>
-          <w:i w:val="0"/>
-        </w:rPr>
-        <w:t xml:space="preserve">Tools: </w:t>
-      </w:r>
       <w:r>
         <w:rPr>
           <w:b w:val="0"/>
           <w:i w:val="0"/>
-        </w:rPr>
-        <w:t>Git, GitHub, Docker, Postman, AWS</w:t>
-      </w:r>
-    </w:p>
-    <w:p>
-      <w:pPr>
-        <w:spacing w:before="100" w:after="40"/>
-        <w:pBdr>
-          <w:top w:val="single" w:sz="5" w:space="3" w:color="B8B8B8"/>
-        </w:pBdr>
-      </w:pPr>
-      <w:r>
-        <w:rPr>
-          <w:b/>
-          <w:i w:val="0"/>
-          <w:color w:val="264D91"/>
-          <w:sz w:val="19"/>
+          <w:color w:val="69809E"/>
+          <w:sz w:val="18"/>
         </w:rPr>
         <w:t>PROJECTS</w:t>
       </w:r>
     </w:p>
     <w:p>
       <w:pPr>
-        <w:spacing w:before="30" w:after="20"/>
+        <w:spacing w:before="50" w:after="24"/>
         <w:jc w:val="left"/>
       </w:pPr>
       <w:r>
         <w:rPr>
-          <w:b/>
+          <w:b w:val="0"/>
           <w:i w:val="0"/>
-          <w:color w:val="1C2A37"/>
-          <w:sz w:val="17"/>
+          <w:color w:val="313B48"/>
+          <w:sz w:val="18"/>
         </w:rPr>
         <w:t>ASIP — Autonomous Society Infrastructure Platform</w:t>
       </w:r>
@@ -381,8 +361,8 @@
     </w:p>
     <w:p>
       <w:pPr>
-        <w:spacing w:after="20"/>
-        <w:ind w:left="202" w:hanging="173"/>
+        <w:spacing w:after="36"/>
+        <w:ind w:left="230" w:hanging="173"/>
         <w:jc w:val="both"/>
       </w:pPr>
       <w:r>
@@ -397,13 +377,13 @@
           <w:b w:val="0"/>
           <w:i w:val="0"/>
         </w:rPr>
-        <w:t>Architected a 7-agent incident-management platform across 4 categories using FastAPI, PostgreSQL, LangGraph, LangChain, ChromaDB, and RAG to diagnose incidents, assess impact, select contractors, and communicate with residents.</w:t>
+        <w:t>Designed a multi-agent workflow that takes a reported society issue from intake through diagnosis, impact assessment, contractor recommendation, and resident updates. Built with FastAPI, PostgreSQL, LangGraph, LangChain, and RAG across 7 agents and 4 incident categories.</w:t>
       </w:r>
     </w:p>
     <w:p>
       <w:pPr>
-        <w:spacing w:after="20"/>
-        <w:ind w:left="202" w:hanging="173"/>
+        <w:spacing w:after="36"/>
+        <w:ind w:left="230" w:hanging="173"/>
         <w:jc w:val="both"/>
       </w:pPr>
       <w:r>
@@ -418,62 +398,20 @@
           <w:b w:val="0"/>
           <w:i w:val="0"/>
         </w:rPr>
-        <w:t>Built 15+ REST APIs across 15+ database entities, with 4-role RBAC, async SQLAlchemy, Alembic migrations, structured LLM outputs, and GPT-4 fallback.</w:t>
+        <w:t>Implemented 15+ REST APIs, 15+ database entities, 4-role RBAC, and repair cost/duration estimates. Added idempotency, circuit breakers, Saga recovery, and correlation-ID tracing; exercised the system with 88 tests and Locust.</w:t>
       </w:r>
     </w:p>
     <w:p>
       <w:pPr>
-        <w:spacing w:after="20"/>
-        <w:ind w:left="202" w:hanging="173"/>
-        <w:jc w:val="both"/>
+        <w:spacing w:before="50" w:after="24"/>
+        <w:jc w:val="left"/>
       </w:pPr>
-      <w:r>
-        <w:rPr>
-          <w:b/>
-          <w:i w:val="0"/>
-        </w:rPr>
-        <w:t xml:space="preserve">• </w:t>
-      </w:r>
       <w:r>
         <w:rPr>
           <w:b w:val="0"/>
           <w:i w:val="0"/>
-        </w:rPr>
-        <w:t>Implemented 6+ impact metrics and predictive workflows for repair cost and duration.</w:t>
-      </w:r>
-    </w:p>
-    <w:p>
-      <w:pPr>
-        <w:spacing w:after="20"/>
-        <w:ind w:left="202" w:hanging="173"/>
-        <w:jc w:val="both"/>
-      </w:pPr>
-      <w:r>
-        <w:rPr>
-          <w:b/>
-          <w:i w:val="0"/>
-        </w:rPr>
-        <w:t xml:space="preserve">• </w:t>
-      </w:r>
-      <w:r>
-        <w:rPr>
-          <w:b w:val="0"/>
-          <w:i w:val="0"/>
-        </w:rPr>
-        <w:t>Added idempotency, checkpointing, circuit breakers, Saga recovery, and correlation-ID tracing; validated with Docker, Locust, and 88 automated tests.</w:t>
-      </w:r>
-    </w:p>
-    <w:p>
-      <w:pPr>
-        <w:spacing w:before="30" w:after="20"/>
-        <w:jc w:val="left"/>
-      </w:pPr>
-      <w:r>
-        <w:rPr>
-          <w:b/>
-          <w:i w:val="0"/>
-          <w:color w:val="1C2A37"/>
-          <w:sz w:val="17"/>
+          <w:color w:val="313B48"/>
+          <w:sz w:val="18"/>
         </w:rPr>
         <w:t>Placement Companion — Android Placement Prep App</w:t>
       </w:r>
@@ -496,8 +434,8 @@
     </w:p>
     <w:p>
       <w:pPr>
-        <w:spacing w:after="20"/>
-        <w:ind w:left="202" w:hanging="173"/>
+        <w:spacing w:after="36"/>
+        <w:ind w:left="230" w:hanging="173"/>
         <w:jc w:val="both"/>
       </w:pPr>
       <w:r>
@@ -512,13 +450,13 @@
           <w:b w:val="0"/>
           <w:i w:val="0"/>
         </w:rPr>
-        <w:t>Collaborated with a teammate on a Kotlin/Jetpack Compose app using Room and DataStore for study planning, preparation tracking, bookmarks, and offline company-question search; the APK is about 32 MB and targets SDK 35 (Android 8+ / API 26+).</w:t>
+        <w:t>Built with a teammate in Kotlin and Jetpack Compose to help students plan preparation, track study, bookmark questions, and search company interview questions offline.</w:t>
       </w:r>
     </w:p>
     <w:p>
       <w:pPr>
-        <w:spacing w:after="20"/>
-        <w:ind w:left="202" w:hanging="173"/>
+        <w:spacing w:after="36"/>
+        <w:ind w:left="230" w:hanging="173"/>
         <w:jc w:val="both"/>
       </w:pPr>
       <w:r>
@@ -533,20 +471,20 @@
           <w:b w:val="0"/>
           <w:i w:val="0"/>
         </w:rPr>
-        <w:t>The app includes Groq-powered study planning, doubt assistance, and interview feedback, plus an offline dataset with 17,826 question entries across 659 companies.</w:t>
+        <w:t>Added Groq-powered study plans, doubt assistance, and interview feedback; the offline library covers 17,826 questions from 659 companies. Packaged as a 32 MB APK for Android 8+ (API 26+), targeting SDK 35.</w:t>
       </w:r>
     </w:p>
     <w:p>
       <w:pPr>
-        <w:spacing w:before="30" w:after="20"/>
+        <w:spacing w:before="50" w:after="24"/>
         <w:jc w:val="left"/>
       </w:pPr>
       <w:r>
         <w:rPr>
-          <w:b/>
+          <w:b w:val="0"/>
           <w:i w:val="0"/>
-          <w:color w:val="1C2A37"/>
-          <w:sz w:val="17"/>
+          <w:color w:val="313B48"/>
+          <w:sz w:val="18"/>
         </w:rPr>
         <w:t>Code Obfuscator</w:t>
       </w:r>
@@ -569,8 +507,8 @@
     </w:p>
     <w:p>
       <w:pPr>
-        <w:spacing w:after="20"/>
-        <w:ind w:left="202" w:hanging="173"/>
+        <w:spacing w:after="36"/>
+        <w:ind w:left="230" w:hanging="173"/>
         <w:jc w:val="both"/>
       </w:pPr>
       <w:r>
@@ -585,20 +523,20 @@
           <w:b w:val="0"/>
           <w:i w:val="0"/>
         </w:rPr>
-        <w:t>Built a Flask-backed C++ obfuscation tool with configurable identifier renaming, junk-code insertion, opaque predicates, string obfuscation, and numeric-literal masking.</w:t>
+        <w:t>Built a Flask web tool for transforming C++ source with selectable identifier renaming, junk-code insertion, opaque predicates, string obfuscation, and numeric-literal masking.</w:t>
       </w:r>
     </w:p>
     <w:p>
       <w:pPr>
-        <w:spacing w:before="30" w:after="20"/>
+        <w:spacing w:before="50" w:after="24"/>
         <w:jc w:val="left"/>
       </w:pPr>
       <w:r>
         <w:rPr>
-          <w:b/>
+          <w:b w:val="0"/>
           <w:i w:val="0"/>
-          <w:color w:val="1C2A37"/>
-          <w:sz w:val="17"/>
+          <w:color w:val="313B48"/>
+          <w:sz w:val="18"/>
         </w:rPr>
         <w:t>Sketch It — Real-Time Multiplayer Game</w:t>
       </w:r>
@@ -630,8 +568,8 @@
     </w:p>
     <w:p>
       <w:pPr>
-        <w:spacing w:after="20"/>
-        <w:ind w:left="202" w:hanging="173"/>
+        <w:spacing w:after="36"/>
+        <w:ind w:left="230" w:hanging="173"/>
         <w:jc w:val="both"/>
       </w:pPr>
       <w:r>
@@ -646,13 +584,45 @@
           <w:b w:val="0"/>
           <w:i w:val="0"/>
         </w:rPr>
-        <w:t>Built a real-time multiplayer sketch-and-guess application using Node.js, Express.js, and Socket.io, implementing event-driven bidirectional communication for drawing, guessing, and chat.</w:t>
+        <w:t>Created a browser-based drawing-and-guessing game: one player draws while others guess, with Socket.io synchronizing turns, chat, and scoring across the room.</w:t>
       </w:r>
     </w:p>
     <w:p>
       <w:pPr>
-        <w:spacing w:after="20"/>
-        <w:ind w:left="202" w:hanging="173"/>
+        <w:spacing w:before="120" w:after="50"/>
+        <w:pBdr>
+          <w:top w:val="single" w:sz="4" w:space="3" w:color="D3DAE3"/>
+        </w:pBdr>
+      </w:pPr>
+      <w:r>
+        <w:rPr>
+          <w:b w:val="0"/>
+          <w:i w:val="0"/>
+          <w:color w:val="69809E"/>
+          <w:sz w:val="18"/>
+        </w:rPr>
+        <w:t>EXPERIENCE</w:t>
+      </w:r>
+    </w:p>
+    <w:p>
+      <w:pPr>
+        <w:spacing w:before="50" w:after="24"/>
+        <w:jc w:val="left"/>
+      </w:pPr>
+      <w:r>
+        <w:rPr>
+          <w:b w:val="0"/>
+          <w:i w:val="0"/>
+          <w:color w:val="313B48"/>
+          <w:sz w:val="18"/>
+        </w:rPr>
+        <w:t>AI/ML Intern • National Institute of Technology Tiruchirappalli</w:t>
+      </w:r>
+    </w:p>
+    <w:p>
+      <w:pPr>
+        <w:spacing w:after="36"/>
+        <w:ind w:left="230" w:hanging="173"/>
         <w:jc w:val="both"/>
       </w:pPr>
       <w:r>
@@ -667,37 +637,41 @@
           <w:b w:val="0"/>
           <w:i w:val="0"/>
         </w:rPr>
-        <w:t>Added role-based gameplay, player management, automated drawer rotation, and real-time state synchronization across 60-second rounds, 10-point scoring, and 20 drawing prompts.</w:t>
+        <w:t>Built a Flask application around a transfer-learned YOLO11s-Seg model, trained on 284 custom polygon-annotated camel images to identify head, legs, hump, tail, and stomach.</w:t>
       </w:r>
     </w:p>
     <w:p>
       <w:pPr>
-        <w:spacing w:before="100" w:after="40"/>
-        <w:pBdr>
-          <w:top w:val="single" w:sz="5" w:space="3" w:color="B8B8B8"/>
-        </w:pBdr>
+        <w:spacing w:after="36"/>
+        <w:ind w:left="230" w:hanging="173"/>
+        <w:jc w:val="both"/>
       </w:pPr>
       <w:r>
         <w:rPr>
           <w:b/>
           <w:i w:val="0"/>
-          <w:color w:val="264D91"/>
-          <w:sz w:val="19"/>
         </w:rPr>
-        <w:t>EXPERIENCE</w:t>
+        <w:t xml:space="preserve">• </w:t>
+      </w:r>
+      <w:r>
+        <w:rPr>
+          <w:b w:val="0"/>
+          <w:i w:val="0"/>
+        </w:rPr>
+        <w:t>Now extending the project with additional anatomy and normalized body-ratio comparisons against selected reference camels; this comparison phase is in progress.</w:t>
       </w:r>
     </w:p>
     <w:p>
       <w:pPr>
-        <w:spacing w:before="30" w:after="20"/>
+        <w:spacing w:before="50" w:after="24"/>
         <w:jc w:val="left"/>
       </w:pPr>
       <w:r>
         <w:rPr>
-          <w:b/>
+          <w:b w:val="0"/>
           <w:i w:val="0"/>
-          <w:color w:val="1C2A37"/>
-          <w:sz w:val="17"/>
+          <w:color w:val="313B48"/>
+          <w:sz w:val="18"/>
         </w:rPr>
         <w:t>Backend Developer Intern • Vected Technologies Pvt. Ltd., Indore</w:t>
       </w:r>
@@ -713,8 +687,8 @@
     </w:p>
     <w:p>
       <w:pPr>
-        <w:spacing w:after="20"/>
-        <w:ind w:left="202" w:hanging="173"/>
+        <w:spacing w:after="36"/>
+        <w:ind w:left="230" w:hanging="173"/>
         <w:jc w:val="both"/>
       </w:pPr>
       <w:r>
@@ -729,13 +703,13 @@
           <w:b w:val="0"/>
           <w:i w:val="0"/>
         </w:rPr>
-        <w:t>Contributed to a BigBasket-inspired grocery commerce platform during a 2-month internship.</w:t>
+        <w:t>Contributed backend features to a BigBasket-inspired grocery commerce platform, building 7+ REST endpoints and JWT authentication.</w:t>
       </w:r>
     </w:p>
     <w:p>
       <w:pPr>
-        <w:spacing w:after="20"/>
-        <w:ind w:left="202" w:hanging="173"/>
+        <w:spacing w:after="36"/>
+        <w:ind w:left="230" w:hanging="173"/>
         <w:jc w:val="both"/>
       </w:pPr>
       <w:r>
@@ -750,43 +724,22 @@
           <w:b w:val="0"/>
           <w:i w:val="0"/>
         </w:rPr>
-        <w:t>Built 7+ REST API endpoints and implemented JWT-based authentication and CRUD operations within a structured, team-based development workflow.</w:t>
+        <w:t>Implemented CRUD workflows and validated API behavior with Postman in a team development workflow.</w:t>
       </w:r>
     </w:p>
     <w:p>
       <w:pPr>
-        <w:spacing w:after="20"/>
-        <w:ind w:left="202" w:hanging="173"/>
-        <w:jc w:val="both"/>
+        <w:spacing w:before="120" w:after="50"/>
+        <w:pBdr>
+          <w:top w:val="single" w:sz="4" w:space="3" w:color="D3DAE3"/>
+        </w:pBdr>
       </w:pPr>
-      <w:r>
-        <w:rPr>
-          <w:b/>
-          <w:i w:val="0"/>
-        </w:rPr>
-        <w:t xml:space="preserve">• </w:t>
-      </w:r>
       <w:r>
         <w:rPr>
           <w:b w:val="0"/>
           <w:i w:val="0"/>
-        </w:rPr>
-        <w:t>Validated API functionality through Postman-driven testing and worked with a teammate to deliver features on schedule.</w:t>
-      </w:r>
-    </w:p>
-    <w:p>
-      <w:pPr>
-        <w:spacing w:before="100" w:after="40"/>
-        <w:pBdr>
-          <w:top w:val="single" w:sz="5" w:space="3" w:color="B8B8B8"/>
-        </w:pBdr>
-      </w:pPr>
-      <w:r>
-        <w:rPr>
-          <w:b/>
-          <w:i w:val="0"/>
-          <w:color w:val="264D91"/>
-          <w:sz w:val="19"/>
+          <w:color w:val="69809E"/>
+          <w:sz w:val="18"/>
         </w:rPr>
         <w:t>EDUCATION</w:t>
       </w:r>
@@ -798,7 +751,7 @@
       </w:pPr>
       <w:r>
         <w:rPr>
-          <w:b/>
+          <w:b w:val="0"/>
           <w:i w:val="0"/>
         </w:rPr>
         <w:t>Master of Computer Applications (M.C.A.) • NIT Trichy • GPA: 7.73/10</w:t>
@@ -818,7 +771,7 @@
       </w:pPr>
       <w:r>
         <w:rPr>
-          <w:b/>
+          <w:b w:val="0"/>
           <w:i w:val="0"/>
         </w:rPr>
         <w:t>Bachelor of Science in Computer Science • Sanskar College of Professional Studies, Indore • GPA: 8.06/10</w:t>
@@ -833,17 +786,17 @@
     </w:p>
     <w:p>
       <w:pPr>
-        <w:spacing w:before="100" w:after="40"/>
+        <w:spacing w:before="120" w:after="50"/>
         <w:pBdr>
-          <w:top w:val="single" w:sz="5" w:space="3" w:color="B8B8B8"/>
+          <w:top w:val="single" w:sz="4" w:space="3" w:color="D3DAE3"/>
         </w:pBdr>
       </w:pPr>
       <w:r>
         <w:rPr>
-          <w:b/>
+          <w:b w:val="0"/>
           <w:i w:val="0"/>
-          <w:color w:val="264D91"/>
-          <w:sz w:val="19"/>
+          <w:color w:val="69809E"/>
+          <w:sz w:val="18"/>
         </w:rPr>
         <w:t>ACHIEVEMENTS &amp; COMPETITIVE PROGRAMMING</w:t>
       </w:r>
@@ -874,92 +827,9 @@
         <w:t>Problem Solving: 800+ DSA problems overall | Peak LeetCode Rating: 1806 (Top 8.06%) | CodeChef: 1403</w:t>
       </w:r>
     </w:p>
-    <w:p>
-      <w:pPr>
-        <w:spacing w:before="100" w:after="40"/>
-        <w:pBdr>
-          <w:top w:val="single" w:sz="5" w:space="3" w:color="B8B8B8"/>
-        </w:pBdr>
-      </w:pPr>
-      <w:r>
-        <w:rPr>
-          <w:b/>
-          <w:i w:val="0"/>
-          <w:color w:val="264D91"/>
-          <w:sz w:val="19"/>
-        </w:rPr>
-        <w:t>LEADERSHIP</w:t>
-      </w:r>
-    </w:p>
-    <w:p>
-      <w:pPr>
-        <w:spacing w:before="30" w:after="20"/>
-        <w:jc w:val="left"/>
-      </w:pPr>
-      <w:r>
-        <w:rPr>
-          <w:b/>
-          <w:i w:val="0"/>
-          <w:color w:val="1C2A37"/>
-          <w:sz w:val="17"/>
-        </w:rPr>
-        <w:t>Volunteer, VERSION'25 Event • NIT Trichy</w:t>
-      </w:r>
-      <w:r>
-        <w:rPr>
-          <w:b w:val="0"/>
-          <w:i w:val="0"/>
-          <w:color w:val="50585F"/>
-          <w:sz w:val="16"/>
-        </w:rPr>
-        <w:t xml:space="preserve">   Mar 2025</w:t>
-      </w:r>
-    </w:p>
-    <w:p>
-      <w:pPr>
-        <w:spacing w:after="20"/>
-        <w:ind w:left="202" w:hanging="173"/>
-        <w:jc w:val="both"/>
-      </w:pPr>
-      <w:r>
-        <w:rPr>
-          <w:b/>
-          <w:i w:val="0"/>
-        </w:rPr>
-        <w:t xml:space="preserve">• </w:t>
-      </w:r>
-      <w:r>
-        <w:rPr>
-          <w:b w:val="0"/>
-          <w:i w:val="0"/>
-        </w:rPr>
-        <w:t>Coordinated logistics and registration for VERSION'25, the 33rd edition of NIT Trichy's All India MCA Meet, a 3-day festival of technical and non-technical events.</w:t>
-      </w:r>
-    </w:p>
-    <w:p>
-      <w:pPr>
-        <w:spacing w:after="20"/>
-        <w:ind w:left="202" w:hanging="173"/>
-        <w:jc w:val="both"/>
-      </w:pPr>
-      <w:r>
-        <w:rPr>
-          <w:b/>
-          <w:i w:val="0"/>
-        </w:rPr>
-        <w:t xml:space="preserve">• </w:t>
-      </w:r>
-      <w:r>
-        <w:rPr>
-          <w:b w:val="0"/>
-          <w:i w:val="0"/>
-        </w:rPr>
-        <w:t>Supported cross-institution communication, hospitality, and alumni engagement for 130+ participants from 30+ institutions, and organized 11 events spanning coding, UI/UX, and web design.</w:t>
-      </w:r>
-    </w:p>
     <w:sectPr>
       <w:pgSz w:w="12240" w:h="15840"/>
-      <w:pgMar w:top="605" w:right="662" w:bottom="605" w:left="662" w:header="720" w:footer="720" w:gutter="0"/>
+      <w:pgMar w:top="691" w:right="749" w:bottom="691" w:left="749" w:header="720" w:footer="720" w:gutter="0"/>
       <w:cols w:space="720"/>
       <w:docGrid w:linePitch="360"/>
     </w:sectPr>
@@ -1331,12 +1201,12 @@
     <w:qFormat/>
     <w:rsid w:val="00FC693F"/>
     <w:pPr>
-      <w:spacing w:after="20" w:line="240" w:lineRule="auto"/>
+      <w:spacing w:after="30" w:line="245" w:lineRule="auto"/>
     </w:pPr>
     <w:rPr>
       <w:rFonts w:ascii="Times New Roman" w:hAnsi="Times New Roman" w:eastAsia="Times New Roman"/>
-      <w:color w:val="232A32"/>
-      <w:sz w:val="16"/>
+      <w:color w:val="2A2F37"/>
+      <w:sz w:val="17"/>
     </w:rPr>
   </w:style>
   <w:style w:type="paragraph" w:styleId="Header">

</xml_diff>

<commit_message>
Restore leadership and NIT internship dates
</commit_message>
<xml_diff>
--- a/Kratish_Mewada_Resume.docx
+++ b/Kratish_Mewada_Resume.docx
@@ -141,7 +141,7 @@
     </w:p>
     <w:p>
       <w:pPr>
-        <w:spacing w:before="120" w:after="50"/>
+        <w:spacing w:before="90" w:after="40"/>
         <w:pBdr>
           <w:top w:val="single" w:sz="4" w:space="3" w:color="D3DAE3"/>
         </w:pBdr>
@@ -171,7 +171,7 @@
     </w:p>
     <w:p>
       <w:pPr>
-        <w:spacing w:before="120" w:after="50"/>
+        <w:spacing w:before="90" w:after="40"/>
         <w:pBdr>
           <w:top w:val="single" w:sz="4" w:space="3" w:color="D3DAE3"/>
         </w:pBdr>
@@ -288,7 +288,7 @@
     </w:p>
     <w:p>
       <w:pPr>
-        <w:spacing w:before="120" w:after="50"/>
+        <w:spacing w:before="90" w:after="40"/>
         <w:pBdr>
           <w:top w:val="single" w:sz="4" w:space="3" w:color="D3DAE3"/>
         </w:pBdr>
@@ -361,7 +361,7 @@
     </w:p>
     <w:p>
       <w:pPr>
-        <w:spacing w:after="36"/>
+        <w:spacing w:after="24"/>
         <w:ind w:left="230" w:hanging="173"/>
         <w:jc w:val="both"/>
       </w:pPr>
@@ -382,7 +382,7 @@
     </w:p>
     <w:p>
       <w:pPr>
-        <w:spacing w:after="36"/>
+        <w:spacing w:after="24"/>
         <w:ind w:left="230" w:hanging="173"/>
         <w:jc w:val="both"/>
       </w:pPr>
@@ -434,7 +434,7 @@
     </w:p>
     <w:p>
       <w:pPr>
-        <w:spacing w:after="36"/>
+        <w:spacing w:after="24"/>
         <w:ind w:left="230" w:hanging="173"/>
         <w:jc w:val="both"/>
       </w:pPr>
@@ -455,7 +455,7 @@
     </w:p>
     <w:p>
       <w:pPr>
-        <w:spacing w:after="36"/>
+        <w:spacing w:after="24"/>
         <w:ind w:left="230" w:hanging="173"/>
         <w:jc w:val="both"/>
       </w:pPr>
@@ -507,7 +507,7 @@
     </w:p>
     <w:p>
       <w:pPr>
-        <w:spacing w:after="36"/>
+        <w:spacing w:after="24"/>
         <w:ind w:left="230" w:hanging="173"/>
         <w:jc w:val="both"/>
       </w:pPr>
@@ -568,7 +568,7 @@
     </w:p>
     <w:p>
       <w:pPr>
-        <w:spacing w:after="36"/>
+        <w:spacing w:after="24"/>
         <w:ind w:left="230" w:hanging="173"/>
         <w:jc w:val="both"/>
       </w:pPr>
@@ -589,7 +589,7 @@
     </w:p>
     <w:p>
       <w:pPr>
-        <w:spacing w:before="120" w:after="50"/>
+        <w:spacing w:before="90" w:after="40"/>
         <w:pBdr>
           <w:top w:val="single" w:sz="4" w:space="3" w:color="D3DAE3"/>
         </w:pBdr>
@@ -618,10 +618,19 @@
         </w:rPr>
         <w:t>AI/ML Intern • National Institute of Technology Tiruchirappalli</w:t>
       </w:r>
+      <w:r>
+        <w:rPr>
+          <w:b w:val="0"/>
+          <w:i w:val="0"/>
+          <w:color w:val="50585F"/>
+          <w:sz w:val="16"/>
+        </w:rPr>
+        <w:t xml:space="preserve">   Jun – Jul 2026</w:t>
+      </w:r>
     </w:p>
     <w:p>
       <w:pPr>
-        <w:spacing w:after="36"/>
+        <w:spacing w:after="24"/>
         <w:ind w:left="230" w:hanging="173"/>
         <w:jc w:val="both"/>
       </w:pPr>
@@ -642,7 +651,7 @@
     </w:p>
     <w:p>
       <w:pPr>
-        <w:spacing w:after="36"/>
+        <w:spacing w:after="24"/>
         <w:ind w:left="230" w:hanging="173"/>
         <w:jc w:val="both"/>
       </w:pPr>
@@ -687,7 +696,7 @@
     </w:p>
     <w:p>
       <w:pPr>
-        <w:spacing w:after="36"/>
+        <w:spacing w:after="24"/>
         <w:ind w:left="230" w:hanging="173"/>
         <w:jc w:val="both"/>
       </w:pPr>
@@ -708,7 +717,7 @@
     </w:p>
     <w:p>
       <w:pPr>
-        <w:spacing w:after="36"/>
+        <w:spacing w:after="24"/>
         <w:ind w:left="230" w:hanging="173"/>
         <w:jc w:val="both"/>
       </w:pPr>
@@ -729,7 +738,7 @@
     </w:p>
     <w:p>
       <w:pPr>
-        <w:spacing w:before="120" w:after="50"/>
+        <w:spacing w:before="90" w:after="40"/>
         <w:pBdr>
           <w:top w:val="single" w:sz="4" w:space="3" w:color="D3DAE3"/>
         </w:pBdr>
@@ -786,7 +795,7 @@
     </w:p>
     <w:p>
       <w:pPr>
-        <w:spacing w:before="120" w:after="50"/>
+        <w:spacing w:before="90" w:after="40"/>
         <w:pBdr>
           <w:top w:val="single" w:sz="4" w:space="3" w:color="D3DAE3"/>
         </w:pBdr>
@@ -827,9 +836,71 @@
         <w:t>Problem Solving: 800+ DSA problems overall | Peak LeetCode Rating: 1806 (Top 8.06%) | CodeChef: 1403</w:t>
       </w:r>
     </w:p>
+    <w:p>
+      <w:pPr>
+        <w:spacing w:before="90" w:after="40"/>
+        <w:pBdr>
+          <w:top w:val="single" w:sz="4" w:space="3" w:color="D3DAE3"/>
+        </w:pBdr>
+      </w:pPr>
+      <w:r>
+        <w:rPr>
+          <w:b w:val="0"/>
+          <w:i w:val="0"/>
+          <w:color w:val="69809E"/>
+          <w:sz w:val="18"/>
+        </w:rPr>
+        <w:t>LEADERSHIP</w:t>
+      </w:r>
+    </w:p>
+    <w:p>
+      <w:pPr>
+        <w:spacing w:before="50" w:after="24"/>
+        <w:jc w:val="left"/>
+      </w:pPr>
+      <w:r>
+        <w:rPr>
+          <w:b w:val="0"/>
+          <w:i w:val="0"/>
+          <w:color w:val="313B48"/>
+          <w:sz w:val="18"/>
+        </w:rPr>
+        <w:t>Volunteer, VERSION'25 Event • NIT Trichy</w:t>
+      </w:r>
+      <w:r>
+        <w:rPr>
+          <w:b w:val="0"/>
+          <w:i w:val="0"/>
+          <w:color w:val="50585F"/>
+          <w:sz w:val="16"/>
+        </w:rPr>
+        <w:t xml:space="preserve">   Mar 2025</w:t>
+      </w:r>
+    </w:p>
+    <w:p>
+      <w:pPr>
+        <w:spacing w:after="24"/>
+        <w:ind w:left="230" w:hanging="173"/>
+        <w:jc w:val="both"/>
+      </w:pPr>
+      <w:r>
+        <w:rPr>
+          <w:b/>
+          <w:i w:val="0"/>
+        </w:rPr>
+        <w:t xml:space="preserve">• </w:t>
+      </w:r>
+      <w:r>
+        <w:rPr>
+          <w:b w:val="0"/>
+          <w:i w:val="0"/>
+        </w:rPr>
+        <w:t>Coordinated registration and logistics for VERSION'25, NIT Trichy's 3-day All India MCA Meet, supporting 130+ participants from 30+ institutions across 11 events.</w:t>
+      </w:r>
+    </w:p>
     <w:sectPr>
       <w:pgSz w:w="12240" w:h="15840"/>
-      <w:pgMar w:top="691" w:right="749" w:bottom="691" w:left="749" w:header="720" w:footer="720" w:gutter="0"/>
+      <w:pgMar w:top="576" w:right="749" w:bottom="576" w:left="749" w:header="720" w:footer="720" w:gutter="0"/>
       <w:cols w:space="720"/>
       <w:docGrid w:linePitch="360"/>
     </w:sectPr>
@@ -1201,7 +1272,7 @@
     <w:qFormat/>
     <w:rsid w:val="00FC693F"/>
     <w:pPr>
-      <w:spacing w:after="30" w:line="245" w:lineRule="auto"/>
+      <w:spacing w:after="24" w:line="240" w:lineRule="auto"/>
     </w:pPr>
     <w:rPr>
       <w:rFonts w:ascii="Times New Roman" w:hAnsi="Times New Roman" w:eastAsia="Times New Roman"/>

</xml_diff>

<commit_message>
Publish NIT internship dates and leadership update
</commit_message>
<xml_diff>
--- a/Kratish_Mewada_Resume.docx
+++ b/Kratish_Mewada_Resume.docx
@@ -141,7 +141,7 @@
     </w:p>
     <w:p>
       <w:pPr>
-        <w:spacing w:before="120" w:after="50"/>
+        <w:spacing w:before="90" w:after="40"/>
         <w:pBdr>
           <w:top w:val="single" w:sz="4" w:space="3" w:color="D3DAE3"/>
         </w:pBdr>
@@ -171,7 +171,7 @@
     </w:p>
     <w:p>
       <w:pPr>
-        <w:spacing w:before="120" w:after="50"/>
+        <w:spacing w:before="90" w:after="40"/>
         <w:pBdr>
           <w:top w:val="single" w:sz="4" w:space="3" w:color="D3DAE3"/>
         </w:pBdr>
@@ -288,7 +288,7 @@
     </w:p>
     <w:p>
       <w:pPr>
-        <w:spacing w:before="120" w:after="50"/>
+        <w:spacing w:before="90" w:after="40"/>
         <w:pBdr>
           <w:top w:val="single" w:sz="4" w:space="3" w:color="D3DAE3"/>
         </w:pBdr>
@@ -361,7 +361,7 @@
     </w:p>
     <w:p>
       <w:pPr>
-        <w:spacing w:after="36"/>
+        <w:spacing w:after="24"/>
         <w:ind w:left="230" w:hanging="173"/>
         <w:jc w:val="both"/>
       </w:pPr>
@@ -382,7 +382,7 @@
     </w:p>
     <w:p>
       <w:pPr>
-        <w:spacing w:after="36"/>
+        <w:spacing w:after="24"/>
         <w:ind w:left="230" w:hanging="173"/>
         <w:jc w:val="both"/>
       </w:pPr>
@@ -434,7 +434,7 @@
     </w:p>
     <w:p>
       <w:pPr>
-        <w:spacing w:after="36"/>
+        <w:spacing w:after="24"/>
         <w:ind w:left="230" w:hanging="173"/>
         <w:jc w:val="both"/>
       </w:pPr>
@@ -455,7 +455,7 @@
     </w:p>
     <w:p>
       <w:pPr>
-        <w:spacing w:after="36"/>
+        <w:spacing w:after="24"/>
         <w:ind w:left="230" w:hanging="173"/>
         <w:jc w:val="both"/>
       </w:pPr>
@@ -507,7 +507,7 @@
     </w:p>
     <w:p>
       <w:pPr>
-        <w:spacing w:after="36"/>
+        <w:spacing w:after="24"/>
         <w:ind w:left="230" w:hanging="173"/>
         <w:jc w:val="both"/>
       </w:pPr>
@@ -568,7 +568,7 @@
     </w:p>
     <w:p>
       <w:pPr>
-        <w:spacing w:after="36"/>
+        <w:spacing w:after="24"/>
         <w:ind w:left="230" w:hanging="173"/>
         <w:jc w:val="both"/>
       </w:pPr>
@@ -589,7 +589,7 @@
     </w:p>
     <w:p>
       <w:pPr>
-        <w:spacing w:before="120" w:after="50"/>
+        <w:spacing w:before="90" w:after="40"/>
         <w:pBdr>
           <w:top w:val="single" w:sz="4" w:space="3" w:color="D3DAE3"/>
         </w:pBdr>
@@ -618,10 +618,19 @@
         </w:rPr>
         <w:t>AI/ML Intern • National Institute of Technology Tiruchirappalli</w:t>
       </w:r>
+      <w:r>
+        <w:rPr>
+          <w:b w:val="0"/>
+          <w:i w:val="0"/>
+          <w:color w:val="50585F"/>
+          <w:sz w:val="16"/>
+        </w:rPr>
+        <w:t xml:space="preserve">   Jun – Jul 2026</w:t>
+      </w:r>
     </w:p>
     <w:p>
       <w:pPr>
-        <w:spacing w:after="36"/>
+        <w:spacing w:after="24"/>
         <w:ind w:left="230" w:hanging="173"/>
         <w:jc w:val="both"/>
       </w:pPr>
@@ -642,7 +651,7 @@
     </w:p>
     <w:p>
       <w:pPr>
-        <w:spacing w:after="36"/>
+        <w:spacing w:after="24"/>
         <w:ind w:left="230" w:hanging="173"/>
         <w:jc w:val="both"/>
       </w:pPr>
@@ -687,7 +696,7 @@
     </w:p>
     <w:p>
       <w:pPr>
-        <w:spacing w:after="36"/>
+        <w:spacing w:after="24"/>
         <w:ind w:left="230" w:hanging="173"/>
         <w:jc w:val="both"/>
       </w:pPr>
@@ -708,7 +717,7 @@
     </w:p>
     <w:p>
       <w:pPr>
-        <w:spacing w:after="36"/>
+        <w:spacing w:after="24"/>
         <w:ind w:left="230" w:hanging="173"/>
         <w:jc w:val="both"/>
       </w:pPr>
@@ -729,7 +738,7 @@
     </w:p>
     <w:p>
       <w:pPr>
-        <w:spacing w:before="120" w:after="50"/>
+        <w:spacing w:before="90" w:after="40"/>
         <w:pBdr>
           <w:top w:val="single" w:sz="4" w:space="3" w:color="D3DAE3"/>
         </w:pBdr>
@@ -786,7 +795,7 @@
     </w:p>
     <w:p>
       <w:pPr>
-        <w:spacing w:before="120" w:after="50"/>
+        <w:spacing w:before="90" w:after="40"/>
         <w:pBdr>
           <w:top w:val="single" w:sz="4" w:space="3" w:color="D3DAE3"/>
         </w:pBdr>
@@ -827,9 +836,71 @@
         <w:t>Problem Solving: 800+ DSA problems overall | Peak LeetCode Rating: 1806 (Top 8.06%) | CodeChef: 1403</w:t>
       </w:r>
     </w:p>
+    <w:p>
+      <w:pPr>
+        <w:spacing w:before="90" w:after="40"/>
+        <w:pBdr>
+          <w:top w:val="single" w:sz="4" w:space="3" w:color="D3DAE3"/>
+        </w:pBdr>
+      </w:pPr>
+      <w:r>
+        <w:rPr>
+          <w:b w:val="0"/>
+          <w:i w:val="0"/>
+          <w:color w:val="69809E"/>
+          <w:sz w:val="18"/>
+        </w:rPr>
+        <w:t>LEADERSHIP</w:t>
+      </w:r>
+    </w:p>
+    <w:p>
+      <w:pPr>
+        <w:spacing w:before="50" w:after="24"/>
+        <w:jc w:val="left"/>
+      </w:pPr>
+      <w:r>
+        <w:rPr>
+          <w:b w:val="0"/>
+          <w:i w:val="0"/>
+          <w:color w:val="313B48"/>
+          <w:sz w:val="18"/>
+        </w:rPr>
+        <w:t>Volunteer, VERSION'25 Event • NIT Trichy</w:t>
+      </w:r>
+      <w:r>
+        <w:rPr>
+          <w:b w:val="0"/>
+          <w:i w:val="0"/>
+          <w:color w:val="50585F"/>
+          <w:sz w:val="16"/>
+        </w:rPr>
+        <w:t xml:space="preserve">   Mar 2025</w:t>
+      </w:r>
+    </w:p>
+    <w:p>
+      <w:pPr>
+        <w:spacing w:after="24"/>
+        <w:ind w:left="230" w:hanging="173"/>
+        <w:jc w:val="both"/>
+      </w:pPr>
+      <w:r>
+        <w:rPr>
+          <w:b/>
+          <w:i w:val="0"/>
+        </w:rPr>
+        <w:t xml:space="preserve">• </w:t>
+      </w:r>
+      <w:r>
+        <w:rPr>
+          <w:b w:val="0"/>
+          <w:i w:val="0"/>
+        </w:rPr>
+        <w:t>Coordinated registration and logistics for VERSION'25, NIT Trichy's 3-day All India MCA Meet, supporting 130+ participants from 30+ institutions across 11 events.</w:t>
+      </w:r>
+    </w:p>
     <w:sectPr>
       <w:pgSz w:w="12240" w:h="15840"/>
-      <w:pgMar w:top="691" w:right="749" w:bottom="691" w:left="749" w:header="720" w:footer="720" w:gutter="0"/>
+      <w:pgMar w:top="576" w:right="749" w:bottom="576" w:left="749" w:header="720" w:footer="720" w:gutter="0"/>
       <w:cols w:space="720"/>
       <w:docGrid w:linePitch="360"/>
     </w:sectPr>
@@ -1201,7 +1272,7 @@
     <w:qFormat/>
     <w:rsid w:val="00FC693F"/>
     <w:pPr>
-      <w:spacing w:after="30" w:line="245" w:lineRule="auto"/>
+      <w:spacing w:after="24" w:line="240" w:lineRule="auto"/>
     </w:pPr>
     <w:rPr>
       <w:rFonts w:ascii="Times New Roman" w:hAnsi="Times New Roman" w:eastAsia="Times New Roman"/>

</xml_diff>

<commit_message>
Polish resume skills layout and remove repetition
</commit_message>
<xml_diff>
--- a/Kratish_Mewada_Resume.docx
+++ b/Kratish_Mewada_Resume.docx
@@ -150,7 +150,7 @@
         <w:rPr>
           <w:b w:val="0"/>
           <w:i w:val="0"/>
-          <w:color w:val="69809E"/>
+          <w:color w:val="264D91"/>
           <w:sz w:val="18"/>
         </w:rPr>
         <w:t>PROFESSIONAL SUMMARY</w:t>
@@ -166,7 +166,7 @@
           <w:b w:val="0"/>
           <w:i w:val="0"/>
         </w:rPr>
-        <w:t>MCA candidate building backend services, AI/LLM applications, and computer-vision tools. Experienced with API design, database-backed systems, and shipping usable applications; solved 800+ DSA problems overall.</w:t>
+        <w:t>MCA candidate building backend services, AI/LLM applications, and computer-vision tools. Experienced with API design, database-backed systems, and shipping usable applications.</w:t>
       </w:r>
     </w:p>
     <w:p>
@@ -180,7 +180,7 @@
         <w:rPr>
           <w:b w:val="0"/>
           <w:i w:val="0"/>
-          <w:color w:val="69809E"/>
+          <w:color w:val="264D91"/>
           <w:sz w:val="18"/>
         </w:rPr>
         <w:t>TECHNICAL SKILLS</w:t>
@@ -188,8 +188,11 @@
     </w:p>
     <w:p>
       <w:pPr>
+        <w:tabs>
+          <w:tab w:pos="5357" w:val="left"/>
+        </w:tabs>
         <w:spacing w:after="0"/>
-        <w:jc w:val="both"/>
+        <w:jc w:val="left"/>
       </w:pPr>
       <w:r>
         <w:rPr>
@@ -205,12 +208,9 @@
         </w:rPr>
         <w:t>C++, Python, JavaScript, C</w:t>
       </w:r>
-    </w:p>
-    <w:p>
-      <w:pPr>
-        <w:spacing w:after="0"/>
-        <w:jc w:val="both"/>
-      </w:pPr>
+      <w:r>
+        <w:tab/>
+      </w:r>
       <w:r>
         <w:rPr>
           <w:b/>
@@ -223,13 +223,16 @@
           <w:b w:val="0"/>
           <w:i w:val="0"/>
         </w:rPr>
-        <w:t>FastAPI, Node.js, Express.js, REST APIs, Socket.io, AsyncIO</w:t>
+        <w:t>FastAPI, Node.js, Express.js, REST, Socket.io, AsyncIO</w:t>
       </w:r>
     </w:p>
     <w:p>
       <w:pPr>
+        <w:tabs>
+          <w:tab w:pos="5357" w:val="left"/>
+        </w:tabs>
         <w:spacing w:after="0"/>
-        <w:jc w:val="both"/>
+        <w:jc w:val="left"/>
       </w:pPr>
       <w:r>
         <w:rPr>
@@ -245,12 +248,9 @@
         </w:rPr>
         <w:t>LangGraph, LangChain, RAG, ChromaDB, YOLO11-Seg</w:t>
       </w:r>
-    </w:p>
-    <w:p>
-      <w:pPr>
-        <w:spacing w:after="0"/>
-        <w:jc w:val="both"/>
-      </w:pPr>
+      <w:r>
+        <w:tab/>
+      </w:r>
       <w:r>
         <w:rPr>
           <w:b/>
@@ -268,22 +268,42 @@
     </w:p>
     <w:p>
       <w:pPr>
+        <w:tabs>
+          <w:tab w:pos="5357" w:val="left"/>
+        </w:tabs>
         <w:spacing w:after="0"/>
-        <w:jc w:val="both"/>
+        <w:jc w:val="left"/>
       </w:pPr>
       <w:r>
         <w:rPr>
           <w:b/>
           <w:i w:val="0"/>
         </w:rPr>
-        <w:t xml:space="preserve">Tools &amp; Practices: </w:t>
+        <w:t xml:space="preserve">Tools: </w:t>
       </w:r>
       <w:r>
         <w:rPr>
           <w:b w:val="0"/>
           <w:i w:val="0"/>
         </w:rPr>
-        <w:t>Git, Docker, Postman, JWT, RBAC, automated testing</w:t>
+        <w:t>Git, Docker, Postman, AWS</w:t>
+      </w:r>
+      <w:r>
+        <w:tab/>
+      </w:r>
+      <w:r>
+        <w:rPr>
+          <w:b/>
+          <w:i w:val="0"/>
+        </w:rPr>
+        <w:t xml:space="preserve">Engineering: </w:t>
+      </w:r>
+      <w:r>
+        <w:rPr>
+          <w:b w:val="0"/>
+          <w:i w:val="0"/>
+        </w:rPr>
+        <w:t>JWT, RBAC, automated testing, idempotency, circuit breakers</w:t>
       </w:r>
     </w:p>
     <w:p>
@@ -297,7 +317,7 @@
         <w:rPr>
           <w:b w:val="0"/>
           <w:i w:val="0"/>
-          <w:color w:val="69809E"/>
+          <w:color w:val="264D91"/>
           <w:sz w:val="18"/>
         </w:rPr>
         <w:t>PROJECTS</w:t>
@@ -589,6 +609,27 @@
     </w:p>
     <w:p>
       <w:pPr>
+        <w:spacing w:after="24"/>
+        <w:ind w:left="230" w:hanging="173"/>
+        <w:jc w:val="both"/>
+      </w:pPr>
+      <w:r>
+        <w:rPr>
+          <w:b/>
+          <w:i w:val="0"/>
+        </w:rPr>
+        <w:t xml:space="preserve">• </w:t>
+      </w:r>
+      <w:r>
+        <w:rPr>
+          <w:b w:val="0"/>
+          <w:i w:val="0"/>
+        </w:rPr>
+        <w:t>Added 60-second rounds, automatic drawer rotation, 10-point scoring, and 20 drawing prompts.</w:t>
+      </w:r>
+    </w:p>
+    <w:p>
+      <w:pPr>
         <w:spacing w:before="90" w:after="40"/>
         <w:pBdr>
           <w:top w:val="single" w:sz="4" w:space="3" w:color="D3DAE3"/>
@@ -598,7 +639,7 @@
         <w:rPr>
           <w:b w:val="0"/>
           <w:i w:val="0"/>
-          <w:color w:val="69809E"/>
+          <w:color w:val="264D91"/>
           <w:sz w:val="18"/>
         </w:rPr>
         <w:t>EXPERIENCE</w:t>
@@ -747,7 +788,7 @@
         <w:rPr>
           <w:b w:val="0"/>
           <w:i w:val="0"/>
-          <w:color w:val="69809E"/>
+          <w:color w:val="264D91"/>
           <w:sz w:val="18"/>
         </w:rPr>
         <w:t>EDUCATION</w:t>
@@ -804,7 +845,7 @@
         <w:rPr>
           <w:b w:val="0"/>
           <w:i w:val="0"/>
-          <w:color w:val="69809E"/>
+          <w:color w:val="264D91"/>
           <w:sz w:val="18"/>
         </w:rPr>
         <w:t>ACHIEVEMENTS &amp; COMPETITIVE PROGRAMMING</w:t>
@@ -847,7 +888,7 @@
         <w:rPr>
           <w:b w:val="0"/>
           <w:i w:val="0"/>
-          <w:color w:val="69809E"/>
+          <w:color w:val="264D91"/>
           <w:sz w:val="18"/>
         </w:rPr>
         <w:t>LEADERSHIP</w:t>
@@ -900,7 +941,7 @@
     </w:p>
     <w:sectPr>
       <w:pgSz w:w="12240" w:h="15840"/>
-      <w:pgMar w:top="576" w:right="749" w:bottom="576" w:left="749" w:header="720" w:footer="720" w:gutter="0"/>
+      <w:pgMar w:top="490" w:right="749" w:bottom="490" w:left="749" w:header="720" w:footer="720" w:gutter="0"/>
       <w:cols w:space="720"/>
       <w:docGrid w:linePitch="360"/>
     </w:sectPr>

</xml_diff>

<commit_message>
Publish revised resume downloads
</commit_message>
<xml_diff>
--- a/Kratish_Mewada_Resume.docx
+++ b/Kratish_Mewada_Resume.docx
@@ -150,7 +150,7 @@
         <w:rPr>
           <w:b w:val="0"/>
           <w:i w:val="0"/>
-          <w:color w:val="69809E"/>
+          <w:color w:val="264D91"/>
           <w:sz w:val="18"/>
         </w:rPr>
         <w:t>PROFESSIONAL SUMMARY</w:t>
@@ -166,7 +166,7 @@
           <w:b w:val="0"/>
           <w:i w:val="0"/>
         </w:rPr>
-        <w:t>MCA candidate building backend services, AI/LLM applications, and computer-vision tools. Experienced with API design, database-backed systems, and shipping usable applications; solved 800+ DSA problems overall.</w:t>
+        <w:t>MCA candidate building backend services, AI/LLM applications, and computer-vision tools. Experienced with API design, database-backed systems, and shipping usable applications.</w:t>
       </w:r>
     </w:p>
     <w:p>
@@ -180,7 +180,7 @@
         <w:rPr>
           <w:b w:val="0"/>
           <w:i w:val="0"/>
-          <w:color w:val="69809E"/>
+          <w:color w:val="264D91"/>
           <w:sz w:val="18"/>
         </w:rPr>
         <w:t>TECHNICAL SKILLS</w:t>
@@ -188,8 +188,11 @@
     </w:p>
     <w:p>
       <w:pPr>
+        <w:tabs>
+          <w:tab w:pos="5357" w:val="left"/>
+        </w:tabs>
         <w:spacing w:after="0"/>
-        <w:jc w:val="both"/>
+        <w:jc w:val="left"/>
       </w:pPr>
       <w:r>
         <w:rPr>
@@ -205,12 +208,9 @@
         </w:rPr>
         <w:t>C++, Python, JavaScript, C</w:t>
       </w:r>
-    </w:p>
-    <w:p>
-      <w:pPr>
-        <w:spacing w:after="0"/>
-        <w:jc w:val="both"/>
-      </w:pPr>
+      <w:r>
+        <w:tab/>
+      </w:r>
       <w:r>
         <w:rPr>
           <w:b/>
@@ -223,13 +223,16 @@
           <w:b w:val="0"/>
           <w:i w:val="0"/>
         </w:rPr>
-        <w:t>FastAPI, Node.js, Express.js, REST APIs, Socket.io, AsyncIO</w:t>
+        <w:t>FastAPI, Node.js, Express.js, REST, Socket.io, AsyncIO</w:t>
       </w:r>
     </w:p>
     <w:p>
       <w:pPr>
+        <w:tabs>
+          <w:tab w:pos="5357" w:val="left"/>
+        </w:tabs>
         <w:spacing w:after="0"/>
-        <w:jc w:val="both"/>
+        <w:jc w:val="left"/>
       </w:pPr>
       <w:r>
         <w:rPr>
@@ -245,12 +248,9 @@
         </w:rPr>
         <w:t>LangGraph, LangChain, RAG, ChromaDB, YOLO11-Seg</w:t>
       </w:r>
-    </w:p>
-    <w:p>
-      <w:pPr>
-        <w:spacing w:after="0"/>
-        <w:jc w:val="both"/>
-      </w:pPr>
+      <w:r>
+        <w:tab/>
+      </w:r>
       <w:r>
         <w:rPr>
           <w:b/>
@@ -268,22 +268,42 @@
     </w:p>
     <w:p>
       <w:pPr>
+        <w:tabs>
+          <w:tab w:pos="5357" w:val="left"/>
+        </w:tabs>
         <w:spacing w:after="0"/>
-        <w:jc w:val="both"/>
+        <w:jc w:val="left"/>
       </w:pPr>
       <w:r>
         <w:rPr>
           <w:b/>
           <w:i w:val="0"/>
         </w:rPr>
-        <w:t xml:space="preserve">Tools &amp; Practices: </w:t>
+        <w:t xml:space="preserve">Tools: </w:t>
       </w:r>
       <w:r>
         <w:rPr>
           <w:b w:val="0"/>
           <w:i w:val="0"/>
         </w:rPr>
-        <w:t>Git, Docker, Postman, JWT, RBAC, automated testing</w:t>
+        <w:t>Git, Docker, Postman, AWS</w:t>
+      </w:r>
+      <w:r>
+        <w:tab/>
+      </w:r>
+      <w:r>
+        <w:rPr>
+          <w:b/>
+          <w:i w:val="0"/>
+        </w:rPr>
+        <w:t xml:space="preserve">Engineering: </w:t>
+      </w:r>
+      <w:r>
+        <w:rPr>
+          <w:b w:val="0"/>
+          <w:i w:val="0"/>
+        </w:rPr>
+        <w:t>JWT, RBAC, automated testing, idempotency, circuit breakers</w:t>
       </w:r>
     </w:p>
     <w:p>
@@ -297,7 +317,7 @@
         <w:rPr>
           <w:b w:val="0"/>
           <w:i w:val="0"/>
-          <w:color w:val="69809E"/>
+          <w:color w:val="264D91"/>
           <w:sz w:val="18"/>
         </w:rPr>
         <w:t>PROJECTS</w:t>
@@ -589,6 +609,27 @@
     </w:p>
     <w:p>
       <w:pPr>
+        <w:spacing w:after="24"/>
+        <w:ind w:left="230" w:hanging="173"/>
+        <w:jc w:val="both"/>
+      </w:pPr>
+      <w:r>
+        <w:rPr>
+          <w:b/>
+          <w:i w:val="0"/>
+        </w:rPr>
+        <w:t xml:space="preserve">• </w:t>
+      </w:r>
+      <w:r>
+        <w:rPr>
+          <w:b w:val="0"/>
+          <w:i w:val="0"/>
+        </w:rPr>
+        <w:t>Added 60-second rounds, automatic drawer rotation, 10-point scoring, and 20 drawing prompts.</w:t>
+      </w:r>
+    </w:p>
+    <w:p>
+      <w:pPr>
         <w:spacing w:before="90" w:after="40"/>
         <w:pBdr>
           <w:top w:val="single" w:sz="4" w:space="3" w:color="D3DAE3"/>
@@ -598,7 +639,7 @@
         <w:rPr>
           <w:b w:val="0"/>
           <w:i w:val="0"/>
-          <w:color w:val="69809E"/>
+          <w:color w:val="264D91"/>
           <w:sz w:val="18"/>
         </w:rPr>
         <w:t>EXPERIENCE</w:t>
@@ -747,7 +788,7 @@
         <w:rPr>
           <w:b w:val="0"/>
           <w:i w:val="0"/>
-          <w:color w:val="69809E"/>
+          <w:color w:val="264D91"/>
           <w:sz w:val="18"/>
         </w:rPr>
         <w:t>EDUCATION</w:t>
@@ -804,7 +845,7 @@
         <w:rPr>
           <w:b w:val="0"/>
           <w:i w:val="0"/>
-          <w:color w:val="69809E"/>
+          <w:color w:val="264D91"/>
           <w:sz w:val="18"/>
         </w:rPr>
         <w:t>ACHIEVEMENTS &amp; COMPETITIVE PROGRAMMING</w:t>
@@ -847,7 +888,7 @@
         <w:rPr>
           <w:b w:val="0"/>
           <w:i w:val="0"/>
-          <w:color w:val="69809E"/>
+          <w:color w:val="264D91"/>
           <w:sz w:val="18"/>
         </w:rPr>
         <w:t>LEADERSHIP</w:t>
@@ -900,7 +941,7 @@
     </w:p>
     <w:sectPr>
       <w:pgSz w:w="12240" w:h="15840"/>
-      <w:pgMar w:top="576" w:right="749" w:bottom="576" w:left="749" w:header="720" w:footer="720" w:gutter="0"/>
+      <w:pgMar w:top="490" w:right="749" w:bottom="490" w:left="749" w:header="720" w:footer="720" w:gutter="0"/>
       <w:cols w:space="720"/>
       <w:docGrid w:linePitch="360"/>
     </w:sectPr>

</xml_diff>

<commit_message>
Refine resume dates summary and skills layout
</commit_message>
<xml_diff>
--- a/Kratish_Mewada_Resume.docx
+++ b/Kratish_Mewada_Resume.docx
@@ -150,7 +150,7 @@
         <w:rPr>
           <w:b w:val="0"/>
           <w:i w:val="0"/>
-          <w:color w:val="264D91"/>
+          <w:color w:val="1F457F"/>
           <w:sz w:val="18"/>
         </w:rPr>
         <w:t>PROFESSIONAL SUMMARY</w:t>
@@ -166,7 +166,7 @@
           <w:b w:val="0"/>
           <w:i w:val="0"/>
         </w:rPr>
-        <w:t>MCA candidate building backend services, AI/LLM applications, and computer-vision tools. Experienced with API design, database-backed systems, and shipping usable applications.</w:t>
+        <w:t>MCA student at NIT Trichy who enjoys solving practical engineering problems. I learn new tools by building, with project work across backend systems, AI/LLM applications, and computer vision.</w:t>
       </w:r>
     </w:p>
     <w:p>
@@ -180,7 +180,7 @@
         <w:rPr>
           <w:b w:val="0"/>
           <w:i w:val="0"/>
-          <w:color w:val="264D91"/>
+          <w:color w:val="1F457F"/>
           <w:sz w:val="18"/>
         </w:rPr>
         <w:t>TECHNICAL SKILLS</w:t>
@@ -317,7 +317,7 @@
         <w:rPr>
           <w:b w:val="0"/>
           <w:i w:val="0"/>
-          <w:color w:val="264D91"/>
+          <w:color w:val="1F457F"/>
           <w:sz w:val="18"/>
         </w:rPr>
         <w:t>PROJECTS</w:t>
@@ -325,6 +325,9 @@
     </w:p>
     <w:p>
       <w:pPr>
+        <w:tabs>
+          <w:tab w:pos="10742" w:val="right"/>
+        </w:tabs>
         <w:spacing w:before="50" w:after="24"/>
         <w:jc w:val="left"/>
       </w:pPr>
@@ -336,15 +339,6 @@
           <w:sz w:val="18"/>
         </w:rPr>
         <w:t>ASIP — Autonomous Society Infrastructure Platform</w:t>
-      </w:r>
-      <w:r>
-        <w:rPr>
-          <w:b w:val="0"/>
-          <w:i w:val="0"/>
-          <w:color w:val="50585F"/>
-          <w:sz w:val="16"/>
-        </w:rPr>
-        <w:t xml:space="preserve">   Apr – Jul 2026</w:t>
       </w:r>
       <w:r>
         <w:rPr>
@@ -378,6 +372,18 @@
           <w:t>GitHub</w:t>
         </w:r>
       </w:hyperlink>
+      <w:r>
+        <w:tab/>
+      </w:r>
+      <w:r>
+        <w:rPr>
+          <w:b w:val="0"/>
+          <w:i w:val="0"/>
+          <w:color w:val="50585F"/>
+          <w:sz w:val="16"/>
+        </w:rPr>
+        <w:t>Apr – Jul 2026</w:t>
+      </w:r>
     </w:p>
     <w:p>
       <w:pPr>
@@ -548,6 +554,9 @@
     </w:p>
     <w:p>
       <w:pPr>
+        <w:tabs>
+          <w:tab w:pos="10742" w:val="right"/>
+        </w:tabs>
         <w:spacing w:before="50" w:after="24"/>
         <w:jc w:val="left"/>
       </w:pPr>
@@ -559,15 +568,6 @@
           <w:sz w:val="18"/>
         </w:rPr>
         <w:t>Sketch It — Real-Time Multiplayer Game</w:t>
-      </w:r>
-      <w:r>
-        <w:rPr>
-          <w:b w:val="0"/>
-          <w:i w:val="0"/>
-          <w:color w:val="50585F"/>
-          <w:sz w:val="16"/>
-        </w:rPr>
-        <w:t xml:space="preserve">   Apr 2025</w:t>
       </w:r>
       <w:r>
         <w:rPr>
@@ -585,6 +585,18 @@
           <w:t>GitHub</w:t>
         </w:r>
       </w:hyperlink>
+      <w:r>
+        <w:tab/>
+      </w:r>
+      <w:r>
+        <w:rPr>
+          <w:b w:val="0"/>
+          <w:i w:val="0"/>
+          <w:color w:val="50585F"/>
+          <w:sz w:val="16"/>
+        </w:rPr>
+        <w:t>Apr 2025</w:t>
+      </w:r>
     </w:p>
     <w:p>
       <w:pPr>
@@ -639,7 +651,7 @@
         <w:rPr>
           <w:b w:val="0"/>
           <w:i w:val="0"/>
-          <w:color w:val="264D91"/>
+          <w:color w:val="1F457F"/>
           <w:sz w:val="18"/>
         </w:rPr>
         <w:t>EXPERIENCE</w:t>
@@ -647,6 +659,9 @@
     </w:p>
     <w:p>
       <w:pPr>
+        <w:tabs>
+          <w:tab w:pos="10742" w:val="right"/>
+        </w:tabs>
         <w:spacing w:before="50" w:after="24"/>
         <w:jc w:val="left"/>
       </w:pPr>
@@ -660,13 +675,16 @@
         <w:t>AI/ML Intern • National Institute of Technology Tiruchirappalli</w:t>
       </w:r>
       <w:r>
+        <w:tab/>
+      </w:r>
+      <w:r>
         <w:rPr>
           <w:b w:val="0"/>
           <w:i w:val="0"/>
           <w:color w:val="50585F"/>
           <w:sz w:val="16"/>
         </w:rPr>
-        <w:t xml:space="preserve">   Jun – Jul 2026</w:t>
+        <w:t>Jun – Jul 2026</w:t>
       </w:r>
     </w:p>
     <w:p>
@@ -713,6 +731,9 @@
     </w:p>
     <w:p>
       <w:pPr>
+        <w:tabs>
+          <w:tab w:pos="10742" w:val="right"/>
+        </w:tabs>
         <w:spacing w:before="50" w:after="24"/>
         <w:jc w:val="left"/>
       </w:pPr>
@@ -726,13 +747,16 @@
         <w:t>Backend Developer Intern • Vected Technologies Pvt. Ltd., Indore</w:t>
       </w:r>
       <w:r>
+        <w:tab/>
+      </w:r>
+      <w:r>
         <w:rPr>
           <w:b w:val="0"/>
           <w:i w:val="0"/>
           <w:color w:val="50585F"/>
           <w:sz w:val="16"/>
         </w:rPr>
-        <w:t xml:space="preserve">   May – Jun 2025</w:t>
+        <w:t>May – Jun 2025</w:t>
       </w:r>
     </w:p>
     <w:p>
@@ -788,7 +812,7 @@
         <w:rPr>
           <w:b w:val="0"/>
           <w:i w:val="0"/>
-          <w:color w:val="264D91"/>
+          <w:color w:val="1F457F"/>
           <w:sz w:val="18"/>
         </w:rPr>
         <w:t>EDUCATION</w:t>
@@ -796,8 +820,11 @@
     </w:p>
     <w:p>
       <w:pPr>
+        <w:tabs>
+          <w:tab w:pos="10742" w:val="right"/>
+        </w:tabs>
         <w:spacing w:after="0"/>
-        <w:jc w:val="both"/>
+        <w:jc w:val="left"/>
       </w:pPr>
       <w:r>
         <w:rPr>
@@ -807,17 +834,23 @@
         <w:t>Master of Computer Applications (M.C.A.) • NIT Trichy • GPA: 7.73/10</w:t>
       </w:r>
       <w:r>
+        <w:tab/>
+      </w:r>
+      <w:r>
         <w:rPr>
           <w:b w:val="0"/>
           <w:i w:val="0"/>
         </w:rPr>
-        <w:t xml:space="preserve">   Expected 2027</w:t>
+        <w:t>Expected 2027</w:t>
       </w:r>
     </w:p>
     <w:p>
       <w:pPr>
+        <w:tabs>
+          <w:tab w:pos="10742" w:val="right"/>
+        </w:tabs>
         <w:spacing w:after="0"/>
-        <w:jc w:val="both"/>
+        <w:jc w:val="left"/>
       </w:pPr>
       <w:r>
         <w:rPr>
@@ -827,11 +860,14 @@
         <w:t>Bachelor of Science in Computer Science • Sanskar College of Professional Studies, Indore • GPA: 8.06/10</w:t>
       </w:r>
       <w:r>
+        <w:tab/>
+      </w:r>
+      <w:r>
         <w:rPr>
           <w:b w:val="0"/>
           <w:i w:val="0"/>
         </w:rPr>
-        <w:t xml:space="preserve">   2024</w:t>
+        <w:t>2024</w:t>
       </w:r>
     </w:p>
     <w:p>
@@ -845,7 +881,7 @@
         <w:rPr>
           <w:b w:val="0"/>
           <w:i w:val="0"/>
-          <w:color w:val="264D91"/>
+          <w:color w:val="1F457F"/>
           <w:sz w:val="18"/>
         </w:rPr>
         <w:t>ACHIEVEMENTS &amp; COMPETITIVE PROGRAMMING</w:t>
@@ -888,7 +924,7 @@
         <w:rPr>
           <w:b w:val="0"/>
           <w:i w:val="0"/>
-          <w:color w:val="264D91"/>
+          <w:color w:val="1F457F"/>
           <w:sz w:val="18"/>
         </w:rPr>
         <w:t>LEADERSHIP</w:t>
@@ -896,6 +932,9 @@
     </w:p>
     <w:p>
       <w:pPr>
+        <w:tabs>
+          <w:tab w:pos="10742" w:val="right"/>
+        </w:tabs>
         <w:spacing w:before="50" w:after="24"/>
         <w:jc w:val="left"/>
       </w:pPr>
@@ -909,13 +948,16 @@
         <w:t>Volunteer, VERSION'25 Event • NIT Trichy</w:t>
       </w:r>
       <w:r>
+        <w:tab/>
+      </w:r>
+      <w:r>
         <w:rPr>
           <w:b w:val="0"/>
           <w:i w:val="0"/>
           <w:color w:val="50585F"/>
           <w:sz w:val="16"/>
         </w:rPr>
-        <w:t xml:space="preserve">   Mar 2025</w:t>
+        <w:t>Mar 2025</w:t>
       </w:r>
     </w:p>
     <w:p>
@@ -936,7 +978,7 @@
           <w:b w:val="0"/>
           <w:i w:val="0"/>
         </w:rPr>
-        <w:t>Coordinated registration and logistics for VERSION'25, NIT Trichy's 3-day All India MCA Meet, supporting 130+ participants from 30+ institutions across 11 events.</w:t>
+        <w:t>Coordinated VERSION'25 logistics for 130+ attendees from 30+ institutions across 11 events.</w:t>
       </w:r>
     </w:p>
     <w:sectPr>

</xml_diff>

<commit_message>
Publish resume alignment and summary update
</commit_message>
<xml_diff>
--- a/Kratish_Mewada_Resume.docx
+++ b/Kratish_Mewada_Resume.docx
@@ -150,7 +150,7 @@
         <w:rPr>
           <w:b w:val="0"/>
           <w:i w:val="0"/>
-          <w:color w:val="264D91"/>
+          <w:color w:val="1F457F"/>
           <w:sz w:val="18"/>
         </w:rPr>
         <w:t>PROFESSIONAL SUMMARY</w:t>
@@ -166,7 +166,7 @@
           <w:b w:val="0"/>
           <w:i w:val="0"/>
         </w:rPr>
-        <w:t>MCA candidate building backend services, AI/LLM applications, and computer-vision tools. Experienced with API design, database-backed systems, and shipping usable applications.</w:t>
+        <w:t>MCA student at NIT Trichy who enjoys solving practical engineering problems. I learn new tools by building, with project work across backend systems, AI/LLM applications, and computer vision.</w:t>
       </w:r>
     </w:p>
     <w:p>
@@ -180,7 +180,7 @@
         <w:rPr>
           <w:b w:val="0"/>
           <w:i w:val="0"/>
-          <w:color w:val="264D91"/>
+          <w:color w:val="1F457F"/>
           <w:sz w:val="18"/>
         </w:rPr>
         <w:t>TECHNICAL SKILLS</w:t>
@@ -317,7 +317,7 @@
         <w:rPr>
           <w:b w:val="0"/>
           <w:i w:val="0"/>
-          <w:color w:val="264D91"/>
+          <w:color w:val="1F457F"/>
           <w:sz w:val="18"/>
         </w:rPr>
         <w:t>PROJECTS</w:t>
@@ -325,6 +325,9 @@
     </w:p>
     <w:p>
       <w:pPr>
+        <w:tabs>
+          <w:tab w:pos="10742" w:val="right"/>
+        </w:tabs>
         <w:spacing w:before="50" w:after="24"/>
         <w:jc w:val="left"/>
       </w:pPr>
@@ -336,15 +339,6 @@
           <w:sz w:val="18"/>
         </w:rPr>
         <w:t>ASIP — Autonomous Society Infrastructure Platform</w:t>
-      </w:r>
-      <w:r>
-        <w:rPr>
-          <w:b w:val="0"/>
-          <w:i w:val="0"/>
-          <w:color w:val="50585F"/>
-          <w:sz w:val="16"/>
-        </w:rPr>
-        <w:t xml:space="preserve">   Apr – Jul 2026</w:t>
       </w:r>
       <w:r>
         <w:rPr>
@@ -378,6 +372,18 @@
           <w:t>GitHub</w:t>
         </w:r>
       </w:hyperlink>
+      <w:r>
+        <w:tab/>
+      </w:r>
+      <w:r>
+        <w:rPr>
+          <w:b w:val="0"/>
+          <w:i w:val="0"/>
+          <w:color w:val="50585F"/>
+          <w:sz w:val="16"/>
+        </w:rPr>
+        <w:t>Apr – Jul 2026</w:t>
+      </w:r>
     </w:p>
     <w:p>
       <w:pPr>
@@ -548,6 +554,9 @@
     </w:p>
     <w:p>
       <w:pPr>
+        <w:tabs>
+          <w:tab w:pos="10742" w:val="right"/>
+        </w:tabs>
         <w:spacing w:before="50" w:after="24"/>
         <w:jc w:val="left"/>
       </w:pPr>
@@ -559,15 +568,6 @@
           <w:sz w:val="18"/>
         </w:rPr>
         <w:t>Sketch It — Real-Time Multiplayer Game</w:t>
-      </w:r>
-      <w:r>
-        <w:rPr>
-          <w:b w:val="0"/>
-          <w:i w:val="0"/>
-          <w:color w:val="50585F"/>
-          <w:sz w:val="16"/>
-        </w:rPr>
-        <w:t xml:space="preserve">   Apr 2025</w:t>
       </w:r>
       <w:r>
         <w:rPr>
@@ -585,6 +585,18 @@
           <w:t>GitHub</w:t>
         </w:r>
       </w:hyperlink>
+      <w:r>
+        <w:tab/>
+      </w:r>
+      <w:r>
+        <w:rPr>
+          <w:b w:val="0"/>
+          <w:i w:val="0"/>
+          <w:color w:val="50585F"/>
+          <w:sz w:val="16"/>
+        </w:rPr>
+        <w:t>Apr 2025</w:t>
+      </w:r>
     </w:p>
     <w:p>
       <w:pPr>
@@ -639,7 +651,7 @@
         <w:rPr>
           <w:b w:val="0"/>
           <w:i w:val="0"/>
-          <w:color w:val="264D91"/>
+          <w:color w:val="1F457F"/>
           <w:sz w:val="18"/>
         </w:rPr>
         <w:t>EXPERIENCE</w:t>
@@ -647,6 +659,9 @@
     </w:p>
     <w:p>
       <w:pPr>
+        <w:tabs>
+          <w:tab w:pos="10742" w:val="right"/>
+        </w:tabs>
         <w:spacing w:before="50" w:after="24"/>
         <w:jc w:val="left"/>
       </w:pPr>
@@ -660,13 +675,16 @@
         <w:t>AI/ML Intern • National Institute of Technology Tiruchirappalli</w:t>
       </w:r>
       <w:r>
+        <w:tab/>
+      </w:r>
+      <w:r>
         <w:rPr>
           <w:b w:val="0"/>
           <w:i w:val="0"/>
           <w:color w:val="50585F"/>
           <w:sz w:val="16"/>
         </w:rPr>
-        <w:t xml:space="preserve">   Jun – Jul 2026</w:t>
+        <w:t>Jun – Jul 2026</w:t>
       </w:r>
     </w:p>
     <w:p>
@@ -713,6 +731,9 @@
     </w:p>
     <w:p>
       <w:pPr>
+        <w:tabs>
+          <w:tab w:pos="10742" w:val="right"/>
+        </w:tabs>
         <w:spacing w:before="50" w:after="24"/>
         <w:jc w:val="left"/>
       </w:pPr>
@@ -726,13 +747,16 @@
         <w:t>Backend Developer Intern • Vected Technologies Pvt. Ltd., Indore</w:t>
       </w:r>
       <w:r>
+        <w:tab/>
+      </w:r>
+      <w:r>
         <w:rPr>
           <w:b w:val="0"/>
           <w:i w:val="0"/>
           <w:color w:val="50585F"/>
           <w:sz w:val="16"/>
         </w:rPr>
-        <w:t xml:space="preserve">   May – Jun 2025</w:t>
+        <w:t>May – Jun 2025</w:t>
       </w:r>
     </w:p>
     <w:p>
@@ -788,7 +812,7 @@
         <w:rPr>
           <w:b w:val="0"/>
           <w:i w:val="0"/>
-          <w:color w:val="264D91"/>
+          <w:color w:val="1F457F"/>
           <w:sz w:val="18"/>
         </w:rPr>
         <w:t>EDUCATION</w:t>
@@ -796,8 +820,11 @@
     </w:p>
     <w:p>
       <w:pPr>
+        <w:tabs>
+          <w:tab w:pos="10742" w:val="right"/>
+        </w:tabs>
         <w:spacing w:after="0"/>
-        <w:jc w:val="both"/>
+        <w:jc w:val="left"/>
       </w:pPr>
       <w:r>
         <w:rPr>
@@ -807,17 +834,23 @@
         <w:t>Master of Computer Applications (M.C.A.) • NIT Trichy • GPA: 7.73/10</w:t>
       </w:r>
       <w:r>
+        <w:tab/>
+      </w:r>
+      <w:r>
         <w:rPr>
           <w:b w:val="0"/>
           <w:i w:val="0"/>
         </w:rPr>
-        <w:t xml:space="preserve">   Expected 2027</w:t>
+        <w:t>Expected 2027</w:t>
       </w:r>
     </w:p>
     <w:p>
       <w:pPr>
+        <w:tabs>
+          <w:tab w:pos="10742" w:val="right"/>
+        </w:tabs>
         <w:spacing w:after="0"/>
-        <w:jc w:val="both"/>
+        <w:jc w:val="left"/>
       </w:pPr>
       <w:r>
         <w:rPr>
@@ -827,11 +860,14 @@
         <w:t>Bachelor of Science in Computer Science • Sanskar College of Professional Studies, Indore • GPA: 8.06/10</w:t>
       </w:r>
       <w:r>
+        <w:tab/>
+      </w:r>
+      <w:r>
         <w:rPr>
           <w:b w:val="0"/>
           <w:i w:val="0"/>
         </w:rPr>
-        <w:t xml:space="preserve">   2024</w:t>
+        <w:t>2024</w:t>
       </w:r>
     </w:p>
     <w:p>
@@ -845,7 +881,7 @@
         <w:rPr>
           <w:b w:val="0"/>
           <w:i w:val="0"/>
-          <w:color w:val="264D91"/>
+          <w:color w:val="1F457F"/>
           <w:sz w:val="18"/>
         </w:rPr>
         <w:t>ACHIEVEMENTS &amp; COMPETITIVE PROGRAMMING</w:t>
@@ -888,7 +924,7 @@
         <w:rPr>
           <w:b w:val="0"/>
           <w:i w:val="0"/>
-          <w:color w:val="264D91"/>
+          <w:color w:val="1F457F"/>
           <w:sz w:val="18"/>
         </w:rPr>
         <w:t>LEADERSHIP</w:t>
@@ -896,6 +932,9 @@
     </w:p>
     <w:p>
       <w:pPr>
+        <w:tabs>
+          <w:tab w:pos="10742" w:val="right"/>
+        </w:tabs>
         <w:spacing w:before="50" w:after="24"/>
         <w:jc w:val="left"/>
       </w:pPr>
@@ -909,13 +948,16 @@
         <w:t>Volunteer, VERSION'25 Event • NIT Trichy</w:t>
       </w:r>
       <w:r>
+        <w:tab/>
+      </w:r>
+      <w:r>
         <w:rPr>
           <w:b w:val="0"/>
           <w:i w:val="0"/>
           <w:color w:val="50585F"/>
           <w:sz w:val="16"/>
         </w:rPr>
-        <w:t xml:space="preserve">   Mar 2025</w:t>
+        <w:t>Mar 2025</w:t>
       </w:r>
     </w:p>
     <w:p>
@@ -936,7 +978,7 @@
           <w:b w:val="0"/>
           <w:i w:val="0"/>
         </w:rPr>
-        <w:t>Coordinated registration and logistics for VERSION'25, NIT Trichy's 3-day All India MCA Meet, supporting 130+ participants from 30+ institutions across 11 events.</w:t>
+        <w:t>Coordinated VERSION'25 logistics for 130+ attendees from 30+ institutions across 11 events.</w:t>
       </w:r>
     </w:p>
     <w:sectPr>

</xml_diff>